<commit_message>
docs(qa): explain what each commit did in the personal-contribution doc
</commit_message>
<xml_diff>
--- a/docs/qa/Dong_Gop_Ca_Nhan_khoa3107.docx
+++ b/docs/qa/Dong_Gop_Ca_Nhan_khoa3107.docx
@@ -245,7 +245,7 @@
                 <w:sz w:val="20"/>
                 <w:szCs w:val="20"/>
               </w:rPr>
-              <w:t xml:space="preserve">162 / 575 commit của cả repo (~28%)</w:t>
+              <w:t xml:space="preserve">169 / 581 commit của cả repo (~29%)</w:t>
             </w:r>
           </w:p>
         </w:tc>
@@ -337,7 +337,7 @@
                 <w:sz w:val="20"/>
                 <w:szCs w:val="20"/>
               </w:rPr>
-              <w:t xml:space="preserve">+71.731 dòng thêm / −17.592 dòng xóa</w:t>
+              <w:t xml:space="preserve">+77.165 dòng thêm / −18.152 dòng xóa</w:t>
             </w:r>
           </w:p>
         </w:tc>
@@ -429,7 +429,7 @@
                 <w:sz w:val="20"/>
                 <w:szCs w:val="20"/>
               </w:rPr>
-              <w:t xml:space="preserve">578 file khác nhau</w:t>
+              <w:t xml:space="preserve">619 file khác nhau</w:t>
             </w:r>
           </w:p>
         </w:tc>
@@ -521,7 +521,7 @@
                 <w:sz w:val="20"/>
                 <w:szCs w:val="20"/>
               </w:rPr>
-              <w:t xml:space="preserve">05/2026: 1 · 06/2026: 18 · 07/2026: 74 · 08/2026: 70</w:t>
+              <w:t xml:space="preserve">05/2026: 1 · 06/2026: 18 · 07/2026: 74 · 08/2026: 76 (tính đến 17/08)</w:t>
             </w:r>
           </w:p>
         </w:tc>
@@ -551,7 +551,7 @@
                 <w:sz w:val="20"/>
                 <w:szCs w:val="20"/>
               </w:rPr>
-              <w:t xml:space="preserve">Commit đều đặn suốt 4 tháng, KHÔNG dồn vào 2–3 tuần cuối — trả lời trực tiếp câu hỏi guide cảnh báo (mục TC2/TC9).</w:t>
+              <w:t xml:space="preserve">Commit đều đặn suốt 4 tháng, KHÔNG dồn vào 2–3 tuần cuối — trả lời trực tiếp câu hỏi guide cảnh báo (mục TC2/TC9). Vẫn đang tiếp tục thêm tính năng mới ở giai đoạn gần bảo vệ, không phải dừng code từ sớm.</w:t>
             </w:r>
           </w:p>
         </w:tc>
@@ -613,7 +613,7 @@
                 <w:sz w:val="20"/>
                 <w:szCs w:val="20"/>
               </w:rPr>
-              <w:t xml:space="preserve">src/features/candidate (144 lượt), src/core/i18n (58), src/features/hr (46), src/features/interview (38), src/features/admin (29), src/features/studio (27)</w:t>
+              <w:t xml:space="preserve">src/features/candidate (173 lượt), src/features/hr (64), src/core/i18n (60), src/features/interview (41), src/features/admin (33), src/features/studio (31)</w:t>
             </w:r>
           </w:p>
         </w:tc>
@@ -643,7 +643,7 @@
                 <w:sz w:val="20"/>
                 <w:szCs w:val="20"/>
               </w:rPr>
-              <w:t xml:space="preserve">Candidate/Jobseeker Portal là khu vực sở hữu chính; có đóng góp xuyên suốt sang HR, Admin, i18n.</w:t>
+              <w:t xml:space="preserve">Candidate/Jobseeker Portal vẫn là khu vực sở hữu chính; tỷ trọng ở HR tăng rõ rệt trong đợt code mới nhất (Talent search, JD-fit review, Compare recommendations).</w:t>
             </w:r>
           </w:p>
         </w:tc>
@@ -669,7 +669,7 @@
     </w:p>
     <w:p>
       <w:pPr>
-        <w:spacing w:after="60"/>
+        <w:spacing w:after="20"/>
         <w:ind w:left="200"/>
       </w:pPr>
       <w:r>
@@ -687,6 +687,22 @@
           <w:szCs w:val="20"/>
         </w:rPr>
         <w:t xml:space="preserve">feat: add complete Jobseeker AI Interview Practice Portal (13/05/2026)</w:t>
+      </w:r>
+    </w:p>
+    <w:p>
+      <w:pPr>
+        <w:spacing w:after="60"/>
+        <w:ind w:left="420"/>
+      </w:pPr>
+      <w:r>
+        <w:rPr>
+          <w:i/>
+          <w:iCs/>
+          <w:color w:val="444444"/>
+          <w:sz w:val="19"/>
+          <w:szCs w:val="19"/>
+        </w:rPr>
+        <w:t xml:space="preserve">→ Commit khởi tạo toàn bộ khung Candidate Portal từ đầu — dựng bộ khung route, layout, và các trang chính (marketplace, practice, feedback, profile) lần đầu tiên trong repo, làm nền cho mọi tính năng candidate sau này.</w:t>
       </w:r>
     </w:p>
     <w:p>
@@ -704,205 +720,175 @@
         <w:spacing w:after="100" w:before="200"/>
       </w:pPr>
       <w:r>
-        <w:t xml:space="preserve">1. Marketplace, xem chi tiết bộ câu hỏi, luyện tập</w:t>
-      </w:r>
-    </w:p>
-    <w:p>
-      <w:pPr>
-        <w:spacing w:after="60"/>
-        <w:ind w:left="200"/>
-      </w:pPr>
-      <w:r>
-        <w:rPr>
-          <w:rFonts w:ascii="Consolas" w:cs="Consolas" w:eastAsia="Consolas" w:hAnsi="Consolas"/>
-          <w:color w:val="888888"/>
-          <w:sz w:val="18"/>
-          <w:szCs w:val="18"/>
-        </w:rPr>
-        <w:t xml:space="preserve">95ebca2  </w:t>
-      </w:r>
-      <w:r>
-        <w:rPr>
-          <w:sz w:val="20"/>
-          <w:szCs w:val="20"/>
-        </w:rPr>
-        <w:t xml:space="preserve">wire candidate marketplace, practice session, and feedback to real API</w:t>
-      </w:r>
-    </w:p>
-    <w:p>
-      <w:pPr>
-        <w:spacing w:after="60"/>
-        <w:ind w:left="200"/>
-      </w:pPr>
-      <w:r>
-        <w:rPr>
-          <w:rFonts w:ascii="Consolas" w:cs="Consolas" w:eastAsia="Consolas" w:hAnsi="Consolas"/>
-          <w:color w:val="888888"/>
-          <w:sz w:val="18"/>
-          <w:szCs w:val="18"/>
-        </w:rPr>
-        <w:t xml:space="preserve">e972a8c  </w:t>
-      </w:r>
-      <w:r>
-        <w:rPr>
-          <w:sz w:val="20"/>
-          <w:szCs w:val="20"/>
-        </w:rPr>
-        <w:t xml:space="preserve">fix: marketplace search only matched title, not company/skill</w:t>
-      </w:r>
-    </w:p>
-    <w:p>
-      <w:pPr>
-        <w:spacing w:after="60"/>
-        <w:ind w:left="200"/>
-      </w:pPr>
-      <w:r>
-        <w:rPr>
-          <w:rFonts w:ascii="Consolas" w:cs="Consolas" w:eastAsia="Consolas" w:hAnsi="Consolas"/>
-          <w:color w:val="888888"/>
-          <w:sz w:val="18"/>
-          <w:szCs w:val="18"/>
-        </w:rPr>
-        <w:t xml:space="preserve">a7819e2  </w:t>
-      </w:r>
-      <w:r>
-        <w:rPr>
-          <w:sz w:val="20"/>
-          <w:szCs w:val="20"/>
-        </w:rPr>
-        <w:t xml:space="preserve">feat: add company filter to the marketplace</w:t>
-      </w:r>
-    </w:p>
-    <w:p>
-      <w:pPr>
-        <w:spacing w:after="60"/>
-        <w:ind w:left="200"/>
-      </w:pPr>
-      <w:r>
-        <w:rPr>
-          <w:rFonts w:ascii="Consolas" w:cs="Consolas" w:eastAsia="Consolas" w:hAnsi="Consolas"/>
-          <w:color w:val="888888"/>
-          <w:sz w:val="18"/>
-          <w:szCs w:val="18"/>
-        </w:rPr>
-        <w:t xml:space="preserve">870c925  </w:t>
-      </w:r>
-      <w:r>
-        <w:rPr>
-          <w:sz w:val="20"/>
-          <w:szCs w:val="20"/>
-        </w:rPr>
-        <w:t xml:space="preserve">feat: show full company profile on set-detail, not just name/logo</w:t>
-      </w:r>
-    </w:p>
-    <w:p>
-      <w:pPr>
-        <w:spacing w:after="60"/>
-        <w:ind w:left="200"/>
-      </w:pPr>
-      <w:r>
-        <w:rPr>
-          <w:rFonts w:ascii="Consolas" w:cs="Consolas" w:eastAsia="Consolas" w:hAnsi="Consolas"/>
-          <w:color w:val="888888"/>
-          <w:sz w:val="18"/>
-          <w:szCs w:val="18"/>
-        </w:rPr>
-        <w:t xml:space="preserve">f4762f8  </w:t>
-      </w:r>
-      <w:r>
-        <w:rPr>
-          <w:sz w:val="20"/>
-          <w:szCs w:val="20"/>
-        </w:rPr>
-        <w:t xml:space="preserve">fix: marketplace hero “Start Practicing Free” button did nothing</w:t>
-      </w:r>
-    </w:p>
-    <w:p>
-      <w:pPr>
-        <w:spacing w:after="60"/>
-        <w:ind w:left="200"/>
-      </w:pPr>
-      <w:r>
-        <w:rPr>
-          <w:rFonts w:ascii="Consolas" w:cs="Consolas" w:eastAsia="Consolas" w:hAnsi="Consolas"/>
-          <w:color w:val="888888"/>
-          <w:sz w:val="18"/>
-          <w:szCs w:val="18"/>
-        </w:rPr>
-        <w:t xml:space="preserve">ca13e61  </w:t>
-      </w:r>
-      <w:r>
-        <w:rPr>
-          <w:sz w:val="20"/>
-          <w:szCs w:val="20"/>
-        </w:rPr>
-        <w:t xml:space="preserve">feat: auto-submit at time-up, start-new-attempt, honest countdown</w:t>
-      </w:r>
-    </w:p>
-    <w:p>
-      <w:pPr>
-        <w:spacing w:after="60"/>
-        <w:ind w:left="200"/>
-      </w:pPr>
-      <w:r>
-        <w:rPr>
-          <w:rFonts w:ascii="Consolas" w:cs="Consolas" w:eastAsia="Consolas" w:hAnsi="Consolas"/>
-          <w:color w:val="888888"/>
-          <w:sz w:val="18"/>
-          <w:szCs w:val="18"/>
-        </w:rPr>
-        <w:t xml:space="preserve">e258d09  </w:t>
-      </w:r>
-      <w:r>
-        <w:rPr>
-          <w:sz w:val="20"/>
-          <w:szCs w:val="20"/>
-        </w:rPr>
-        <w:t xml:space="preserve">fix: practice timer now reflects the real, server-enforced deadline</w:t>
-      </w:r>
-    </w:p>
-    <w:p>
-      <w:pPr>
-        <w:spacing w:after="60"/>
-        <w:ind w:left="200"/>
-      </w:pPr>
-      <w:r>
-        <w:rPr>
-          <w:rFonts w:ascii="Consolas" w:cs="Consolas" w:eastAsia="Consolas" w:hAnsi="Consolas"/>
-          <w:color w:val="888888"/>
-          <w:sz w:val="18"/>
-          <w:szCs w:val="18"/>
-        </w:rPr>
-        <w:t xml:space="preserve">b85eb0b  </w:t>
-      </w:r>
-      <w:r>
-        <w:rPr>
-          <w:sz w:val="20"/>
-          <w:szCs w:val="20"/>
-        </w:rPr>
-        <w:t xml:space="preserve">fix: practice timer could look frozen after tabbing away</w:t>
-      </w:r>
-    </w:p>
-    <w:p>
-      <w:pPr>
-        <w:spacing w:after="60"/>
-        <w:ind w:left="200"/>
-      </w:pPr>
-      <w:r>
-        <w:rPr>
-          <w:rFonts w:ascii="Consolas" w:cs="Consolas" w:eastAsia="Consolas" w:hAnsi="Consolas"/>
-          <w:color w:val="888888"/>
-          <w:sz w:val="18"/>
-          <w:szCs w:val="18"/>
-        </w:rPr>
-        <w:t xml:space="preserve">53e38c0  </w:t>
-      </w:r>
-      <w:r>
-        <w:rPr>
-          <w:sz w:val="20"/>
-          <w:szCs w:val="20"/>
-        </w:rPr>
-        <w:t xml:space="preserve">fix: dedupe concurrent practice-session start requests</w:t>
+        <w:t xml:space="preserve">0. Đợt tính năng mới nhất (17/08/2026) — 86 file, +5.113/−516 dòng trong một commit</w:t>
+      </w:r>
+    </w:p>
+    <w:p>
+      <w:pPr>
+        <w:spacing w:after="140"/>
+        <w:jc w:val="both"/>
+      </w:pPr>
+      <w:r>
+        <w:t xml:space="preserve">Commit gần đây nhất, quy mô lớn nhất trong toàn bộ lịch sử làm việc, thêm một loạt tính năng mới cho cả hai phía Candidate và HR cùng lúc:</w:t>
+      </w:r>
+    </w:p>
+    <w:p>
+      <w:pPr>
+        <w:spacing w:after="20"/>
+        <w:ind w:left="200"/>
+      </w:pPr>
+      <w:r>
+        <w:rPr>
+          <w:rFonts w:ascii="Consolas" w:cs="Consolas" w:eastAsia="Consolas" w:hAnsi="Consolas"/>
+          <w:color w:val="888888"/>
+          <w:sz w:val="18"/>
+          <w:szCs w:val="18"/>
+        </w:rPr>
+        <w:t xml:space="preserve">8ecdf3b  </w:t>
+      </w:r>
+      <w:r>
+        <w:rPr>
+          <w:sz w:val="20"/>
+          <w:szCs w:val="20"/>
+        </w:rPr>
+        <w:t xml:space="preserve">feat(candidate,hr): add AI Coach, Talent search, JD-fit review, compare recommendations; add cancel-at-period-end grace period; fix Premium lock loss on session resume, cancel-button double-click, and avatar upload leaking unsaved profile edits.</w:t>
+      </w:r>
+    </w:p>
+    <w:p>
+      <w:pPr>
+        <w:spacing w:after="60"/>
+        <w:ind w:left="420"/>
+      </w:pPr>
+      <w:r>
+        <w:rPr>
+          <w:i/>
+          <w:iCs/>
+          <w:color w:val="444444"/>
+          <w:sz w:val="19"/>
+          <w:szCs w:val="19"/>
+        </w:rPr>
+        <w:t xml:space="preserve">→ Một commit gộp nhiều tính năng lớn cùng lúc (86 file) — chi tiết từng phần liệt kê ở các gạch đầu dòng ngay bên dưới.</w:t>
+      </w:r>
+    </w:p>
+    <w:p>
+      <w:pPr>
+        <w:pStyle w:val="ListParagraph"/>
+        <w:numPr>
+          <w:ilvl w:val="0"/>
+          <w:numId w:val="1"/>
+        </w:numPr>
+        <w:spacing w:after="80"/>
+      </w:pPr>
+      <w:r>
+        <w:t xml:space="preserve">AI Coach (Candidate) — trang lộ trình cải thiện kỹ năng cho ứng viên: coach-page.tsx (417 dòng), cùng coach-hero, coach-status-card, coach-skill-plan, coach-steps — toàn bộ file mới, chưa từng tồn tại trước commit này.</w:t>
+      </w:r>
+    </w:p>
+    <w:p>
+      <w:pPr>
+        <w:pStyle w:val="ListParagraph"/>
+        <w:numPr>
+          <w:ilvl w:val="0"/>
+          <w:numId w:val="1"/>
+        </w:numPr>
+        <w:spacing w:after="80"/>
+      </w:pPr>
+      <w:r>
+        <w:t xml:space="preserve">Talent Search (HR) — trang tìm kiếm ứng viên tiềm năng mới cho HR: hr-talent-page.tsx (452 dòng) + hr-talent.service.ts, file hoàn toàn mới.</w:t>
+      </w:r>
+    </w:p>
+    <w:p>
+      <w:pPr>
+        <w:pStyle w:val="ListParagraph"/>
+        <w:numPr>
+          <w:ilvl w:val="0"/>
+          <w:numId w:val="1"/>
+        </w:numPr>
+        <w:spacing w:after="80"/>
+      </w:pPr>
+      <w:r>
+        <w:t xml:space="preserve">JD-fit Review (HR) — bảng đánh giá mức độ phù hợp giữa ứng viên và JD: jd-fit-review-panel.tsx (359 dòng) + hr-jd-fit.service.ts, file hoàn toàn mới.</w:t>
+      </w:r>
+    </w:p>
+    <w:p>
+      <w:pPr>
+        <w:pStyle w:val="ListParagraph"/>
+        <w:numPr>
+          <w:ilvl w:val="0"/>
+          <w:numId w:val="1"/>
+        </w:numPr>
+        <w:spacing w:after="80"/>
+      </w:pPr>
+      <w:r>
+        <w:t xml:space="preserve">Compare Recommendations (HR) — so sánh nhiều ứng viên được gợi ý cạnh nhau: compare-recommendations.tsx + trang riêng /hr/candidate-recommendations/compare.</w:t>
+      </w:r>
+    </w:p>
+    <w:p>
+      <w:pPr>
+        <w:pStyle w:val="ListParagraph"/>
+        <w:numPr>
+          <w:ilvl w:val="0"/>
+          <w:numId w:val="1"/>
+        </w:numPr>
+        <w:spacing w:after="80"/>
+      </w:pPr>
+      <w:r>
+        <w:t xml:space="preserve">hr-session-feedback.tsx (312 dòng, mới) — cho HR xem chi tiết đánh giá AI của một phiên luyện tập cụ thể của candidate.</w:t>
+      </w:r>
+    </w:p>
+    <w:p>
+      <w:pPr>
+        <w:pStyle w:val="ListParagraph"/>
+        <w:numPr>
+          <w:ilvl w:val="0"/>
+          <w:numId w:val="1"/>
+        </w:numPr>
+        <w:spacing w:after="80"/>
+      </w:pPr>
+      <w:r>
+        <w:t xml:space="preserve">invite-candidate-modal.tsx + invite-schedule-fields.tsx (mới) — mời candidate kèm chọn lịch phỏng vấn cụ thể, không chỉ mời suông như trước.</w:t>
+      </w:r>
+    </w:p>
+    <w:p>
+      <w:pPr>
+        <w:pStyle w:val="ListParagraph"/>
+        <w:numPr>
+          <w:ilvl w:val="0"/>
+          <w:numId w:val="1"/>
+        </w:numPr>
+        <w:spacing w:after="80"/>
+      </w:pPr>
+      <w:r>
+        <w:t xml:space="preserve">Cancel-at-period-end grace period (Subscription) — bổ sung logic để việc hủy gói không cắt quyền ngay mà giữ tới hết kỳ đã trả tiền.</w:t>
+      </w:r>
+    </w:p>
+    <w:p>
+      <w:pPr>
+        <w:pStyle w:val="ListParagraph"/>
+        <w:numPr>
+          <w:ilvl w:val="0"/>
+          <w:numId w:val="1"/>
+        </w:numPr>
+        <w:spacing w:after="80"/>
+      </w:pPr>
+      <w:r>
+        <w:t xml:space="preserve">3 lỗi thật tự phát hiện và sửa trong cùng đợt: mất trạng thái khoá tính năng Premium khi resume lại phiên luyện tập đang dở; nút hủy gói bị bấm trùng (double-click) gây gọi API hai lần; upload avatar làm rò rỉ các thay đổi hồ sơ chưa lưu ra ngoài ý muốn.</w:t>
+      </w:r>
+    </w:p>
+    <w:p>
+      <w:pPr>
+        <w:shd w:fill="FDEDEC" w:val="clear"/>
+        <w:spacing w:after="160" w:before="120"/>
+        <w:ind w:left="200" w:right="200"/>
+      </w:pPr>
+      <w:r>
+        <w:rPr>
+          <w:b/>
+          <w:bCs/>
+        </w:rPr>
+        <w:t xml:space="preserve">Vì sao đáng chú ý khi trả lời TC9: </w:t>
+      </w:r>
+      <w:r>
+        <w:t xml:space="preserve">Đây là bằng chứng nhóm/cá nhân vẫn tiếp tục phát triển tính năng thật sát ngày bảo vệ, không dừng lại sớm để chỉ lo làm tài liệu — nhưng cũng có nghĩa những tính năng này (AI Coach, Talent Search, JD-fit Review) là mới nhất, ít thời gian kiểm thử nhất. Nên tự chạy thử kỹ các luồng này trước khi hội đồng yêu cầu demo, vì đây là phần rủi ro cao nhất có bug chưa phát hiện do mới thêm.</w:t>
       </w:r>
     </w:p>
     <w:p>
@@ -911,117 +897,349 @@
         <w:spacing w:after="100" w:before="200"/>
       </w:pPr>
       <w:r>
-        <w:t xml:space="preserve">2. Chấm điểm AI &amp; trang kết quả (Feedback)</w:t>
-      </w:r>
-    </w:p>
-    <w:p>
-      <w:pPr>
-        <w:spacing w:after="60"/>
-        <w:ind w:left="200"/>
-      </w:pPr>
-      <w:r>
-        <w:rPr>
-          <w:rFonts w:ascii="Consolas" w:cs="Consolas" w:eastAsia="Consolas" w:hAnsi="Consolas"/>
-          <w:color w:val="888888"/>
-          <w:sz w:val="18"/>
-          <w:szCs w:val="18"/>
-        </w:rPr>
-        <w:t xml:space="preserve">5be07a7  </w:t>
-      </w:r>
-      <w:r>
-        <w:rPr>
-          <w:sz w:val="20"/>
-          <w:szCs w:val="20"/>
-        </w:rPr>
-        <w:t xml:space="preserve">feat: capture per-question AI evaluation, add skill radar chart</w:t>
-      </w:r>
-    </w:p>
-    <w:p>
-      <w:pPr>
-        <w:spacing w:after="60"/>
-        <w:ind w:left="200"/>
-      </w:pPr>
-      <w:r>
-        <w:rPr>
-          <w:rFonts w:ascii="Consolas" w:cs="Consolas" w:eastAsia="Consolas" w:hAnsi="Consolas"/>
-          <w:color w:val="888888"/>
-          <w:sz w:val="18"/>
-          <w:szCs w:val="18"/>
-        </w:rPr>
-        <w:t xml:space="preserve">3a44bb9  </w:t>
-      </w:r>
-      <w:r>
-        <w:rPr>
-          <w:sz w:val="20"/>
-          <w:szCs w:val="20"/>
-        </w:rPr>
-        <w:t xml:space="preserve">feat: show real per-question AI feedback on the result page</w:t>
-      </w:r>
-    </w:p>
-    <w:p>
-      <w:pPr>
-        <w:spacing w:after="60"/>
-        <w:ind w:left="200"/>
-      </w:pPr>
-      <w:r>
-        <w:rPr>
-          <w:rFonts w:ascii="Consolas" w:cs="Consolas" w:eastAsia="Consolas" w:hAnsi="Consolas"/>
-          <w:color w:val="888888"/>
-          <w:sz w:val="18"/>
-          <w:szCs w:val="18"/>
-        </w:rPr>
-        <w:t xml:space="preserve">d61d45d  </w:t>
-      </w:r>
-      <w:r>
-        <w:rPr>
-          <w:sz w:val="20"/>
-          <w:szCs w:val="20"/>
-        </w:rPr>
-        <w:t xml:space="preserve">feat: use persisted feedback endpoint, add overall AI insight</w:t>
-      </w:r>
-    </w:p>
-    <w:p>
-      <w:pPr>
-        <w:spacing w:after="60"/>
-        <w:ind w:left="200"/>
-      </w:pPr>
-      <w:r>
-        <w:rPr>
-          <w:rFonts w:ascii="Consolas" w:cs="Consolas" w:eastAsia="Consolas" w:hAnsi="Consolas"/>
-          <w:color w:val="888888"/>
-          <w:sz w:val="18"/>
-          <w:szCs w:val="18"/>
-        </w:rPr>
-        <w:t xml:space="preserve">9be9ef5  </w:t>
-      </w:r>
-      <w:r>
-        <w:rPr>
-          <w:sz w:val="20"/>
-          <w:szCs w:val="20"/>
-        </w:rPr>
-        <w:t xml:space="preserve">fix: rating showed a raw 0-10 BE value next to 5 stars</w:t>
-      </w:r>
-    </w:p>
-    <w:p>
-      <w:pPr>
-        <w:spacing w:after="60"/>
-        <w:ind w:left="200"/>
-      </w:pPr>
-      <w:r>
-        <w:rPr>
-          <w:rFonts w:ascii="Consolas" w:cs="Consolas" w:eastAsia="Consolas" w:hAnsi="Consolas"/>
-          <w:color w:val="888888"/>
-          <w:sz w:val="18"/>
-          <w:szCs w:val="18"/>
-        </w:rPr>
-        <w:t xml:space="preserve">fca2a22  </w:t>
-      </w:r>
-      <w:r>
-        <w:rPr>
-          <w:sz w:val="20"/>
-          <w:szCs w:val="20"/>
-        </w:rPr>
-        <w:t xml:space="preserve">feat: clearer pending-score UI, skeleton loading, and small fixes</w:t>
+        <w:t xml:space="preserve">1. Marketplace, xem chi tiết bộ câu hỏi, luyện tập</w:t>
+      </w:r>
+    </w:p>
+    <w:p>
+      <w:pPr>
+        <w:spacing w:after="20"/>
+        <w:ind w:left="200"/>
+      </w:pPr>
+      <w:r>
+        <w:rPr>
+          <w:rFonts w:ascii="Consolas" w:cs="Consolas" w:eastAsia="Consolas" w:hAnsi="Consolas"/>
+          <w:color w:val="888888"/>
+          <w:sz w:val="18"/>
+          <w:szCs w:val="18"/>
+        </w:rPr>
+        <w:t xml:space="preserve">95ebca2  </w:t>
+      </w:r>
+      <w:r>
+        <w:rPr>
+          <w:sz w:val="20"/>
+          <w:szCs w:val="20"/>
+        </w:rPr>
+        <w:t xml:space="preserve">wire candidate marketplace, practice session, and feedback to real API</w:t>
+      </w:r>
+    </w:p>
+    <w:p>
+      <w:pPr>
+        <w:spacing w:after="60"/>
+        <w:ind w:left="420"/>
+      </w:pPr>
+      <w:r>
+        <w:rPr>
+          <w:i/>
+          <w:iCs/>
+          <w:color w:val="444444"/>
+          <w:sz w:val="19"/>
+          <w:szCs w:val="19"/>
+        </w:rPr>
+        <w:t xml:space="preserve">→ Nối marketplace, trang luyện tập và trang kết quả với API thật lần đầu, thay cho dữ liệu giả dùng để dựng UI trước đó.</w:t>
+      </w:r>
+    </w:p>
+    <w:p>
+      <w:pPr>
+        <w:spacing w:after="20"/>
+        <w:ind w:left="200"/>
+      </w:pPr>
+      <w:r>
+        <w:rPr>
+          <w:rFonts w:ascii="Consolas" w:cs="Consolas" w:eastAsia="Consolas" w:hAnsi="Consolas"/>
+          <w:color w:val="888888"/>
+          <w:sz w:val="18"/>
+          <w:szCs w:val="18"/>
+        </w:rPr>
+        <w:t xml:space="preserve">e972a8c  </w:t>
+      </w:r>
+      <w:r>
+        <w:rPr>
+          <w:sz w:val="20"/>
+          <w:szCs w:val="20"/>
+        </w:rPr>
+        <w:t xml:space="preserve">fix: marketplace search only matched title, not company/skill</w:t>
+      </w:r>
+    </w:p>
+    <w:p>
+      <w:pPr>
+        <w:spacing w:after="60"/>
+        <w:ind w:left="420"/>
+      </w:pPr>
+      <w:r>
+        <w:rPr>
+          <w:i/>
+          <w:iCs/>
+          <w:color w:val="444444"/>
+          <w:sz w:val="19"/>
+          <w:szCs w:val="19"/>
+        </w:rPr>
+        <w:t xml:space="preserve">→ Sửa lỗi tìm kiếm chỉ khớp tiêu đề bộ câu hỏi — thêm lọc theo tên công ty và kỹ năng ở phía client.</w:t>
+      </w:r>
+    </w:p>
+    <w:p>
+      <w:pPr>
+        <w:spacing w:after="20"/>
+        <w:ind w:left="200"/>
+      </w:pPr>
+      <w:r>
+        <w:rPr>
+          <w:rFonts w:ascii="Consolas" w:cs="Consolas" w:eastAsia="Consolas" w:hAnsi="Consolas"/>
+          <w:color w:val="888888"/>
+          <w:sz w:val="18"/>
+          <w:szCs w:val="18"/>
+        </w:rPr>
+        <w:t xml:space="preserve">a7819e2  </w:t>
+      </w:r>
+      <w:r>
+        <w:rPr>
+          <w:sz w:val="20"/>
+          <w:szCs w:val="20"/>
+        </w:rPr>
+        <w:t xml:space="preserve">feat: add company filter to the marketplace</w:t>
+      </w:r>
+    </w:p>
+    <w:p>
+      <w:pPr>
+        <w:spacing w:after="60"/>
+        <w:ind w:left="420"/>
+      </w:pPr>
+      <w:r>
+        <w:rPr>
+          <w:i/>
+          <w:iCs/>
+          <w:color w:val="444444"/>
+          <w:sz w:val="19"/>
+          <w:szCs w:val="19"/>
+        </w:rPr>
+        <w:t xml:space="preserve">→ Thêm bộ lọc theo công ty trong marketplace.</w:t>
+      </w:r>
+    </w:p>
+    <w:p>
+      <w:pPr>
+        <w:spacing w:after="20"/>
+        <w:ind w:left="200"/>
+      </w:pPr>
+      <w:r>
+        <w:rPr>
+          <w:rFonts w:ascii="Consolas" w:cs="Consolas" w:eastAsia="Consolas" w:hAnsi="Consolas"/>
+          <w:color w:val="888888"/>
+          <w:sz w:val="18"/>
+          <w:szCs w:val="18"/>
+        </w:rPr>
+        <w:t xml:space="preserve">870c925  </w:t>
+      </w:r>
+      <w:r>
+        <w:rPr>
+          <w:sz w:val="20"/>
+          <w:szCs w:val="20"/>
+        </w:rPr>
+        <w:t xml:space="preserve">feat: show full company profile on set-detail, not just name/logo</w:t>
+      </w:r>
+    </w:p>
+    <w:p>
+      <w:pPr>
+        <w:spacing w:after="60"/>
+        <w:ind w:left="420"/>
+      </w:pPr>
+      <w:r>
+        <w:rPr>
+          <w:i/>
+          <w:iCs/>
+          <w:color w:val="444444"/>
+          <w:sz w:val="19"/>
+          <w:szCs w:val="19"/>
+        </w:rPr>
+        <w:t xml:space="preserve">→ Hiện đầy đủ hồ sơ công ty (không chỉ tên/logo) ở trang chi tiết bộ câu hỏi.</w:t>
+      </w:r>
+    </w:p>
+    <w:p>
+      <w:pPr>
+        <w:spacing w:after="20"/>
+        <w:ind w:left="200"/>
+      </w:pPr>
+      <w:r>
+        <w:rPr>
+          <w:rFonts w:ascii="Consolas" w:cs="Consolas" w:eastAsia="Consolas" w:hAnsi="Consolas"/>
+          <w:color w:val="888888"/>
+          <w:sz w:val="18"/>
+          <w:szCs w:val="18"/>
+        </w:rPr>
+        <w:t xml:space="preserve">f4762f8  </w:t>
+      </w:r>
+      <w:r>
+        <w:rPr>
+          <w:sz w:val="20"/>
+          <w:szCs w:val="20"/>
+        </w:rPr>
+        <w:t xml:space="preserve">fix: marketplace hero “Start Practicing Free” button did nothing</w:t>
+      </w:r>
+    </w:p>
+    <w:p>
+      <w:pPr>
+        <w:spacing w:after="60"/>
+        <w:ind w:left="420"/>
+      </w:pPr>
+      <w:r>
+        <w:rPr>
+          <w:i/>
+          <w:iCs/>
+          <w:color w:val="444444"/>
+          <w:sz w:val="19"/>
+          <w:szCs w:val="19"/>
+        </w:rPr>
+        <w:t xml:space="preserve">→ Sửa nút “Bắt đầu luyện tập miễn phí” ở trang chủ không phản hồi khi bấm.</w:t>
+      </w:r>
+    </w:p>
+    <w:p>
+      <w:pPr>
+        <w:spacing w:after="20"/>
+        <w:ind w:left="200"/>
+      </w:pPr>
+      <w:r>
+        <w:rPr>
+          <w:rFonts w:ascii="Consolas" w:cs="Consolas" w:eastAsia="Consolas" w:hAnsi="Consolas"/>
+          <w:color w:val="888888"/>
+          <w:sz w:val="18"/>
+          <w:szCs w:val="18"/>
+        </w:rPr>
+        <w:t xml:space="preserve">ca13e61  </w:t>
+      </w:r>
+      <w:r>
+        <w:rPr>
+          <w:sz w:val="20"/>
+          <w:szCs w:val="20"/>
+        </w:rPr>
+        <w:t xml:space="preserve">feat: auto-submit at time-up, start-new-attempt, honest countdown</w:t>
+      </w:r>
+    </w:p>
+    <w:p>
+      <w:pPr>
+        <w:spacing w:after="60"/>
+        <w:ind w:left="420"/>
+      </w:pPr>
+      <w:r>
+        <w:rPr>
+          <w:i/>
+          <w:iCs/>
+          <w:color w:val="444444"/>
+          <w:sz w:val="19"/>
+          <w:szCs w:val="19"/>
+        </w:rPr>
+        <w:t xml:space="preserve">→ Thêm tự động nộp bài khi hết giờ, cho phép bắt đầu lại phiên mới, đồng hồ đếm ngược hiển thị đúng.</w:t>
+      </w:r>
+    </w:p>
+    <w:p>
+      <w:pPr>
+        <w:spacing w:after="20"/>
+        <w:ind w:left="200"/>
+      </w:pPr>
+      <w:r>
+        <w:rPr>
+          <w:rFonts w:ascii="Consolas" w:cs="Consolas" w:eastAsia="Consolas" w:hAnsi="Consolas"/>
+          <w:color w:val="888888"/>
+          <w:sz w:val="18"/>
+          <w:szCs w:val="18"/>
+        </w:rPr>
+        <w:t xml:space="preserve">e258d09  </w:t>
+      </w:r>
+      <w:r>
+        <w:rPr>
+          <w:sz w:val="20"/>
+          <w:szCs w:val="20"/>
+        </w:rPr>
+        <w:t xml:space="preserve">fix: practice timer now reflects the real, server-enforced deadline</w:t>
+      </w:r>
+    </w:p>
+    <w:p>
+      <w:pPr>
+        <w:spacing w:after="60"/>
+        <w:ind w:left="420"/>
+      </w:pPr>
+      <w:r>
+        <w:rPr>
+          <w:i/>
+          <w:iCs/>
+          <w:color w:val="444444"/>
+          <w:sz w:val="19"/>
+          <w:szCs w:val="19"/>
+        </w:rPr>
+        <w:t xml:space="preserve">→ Sửa đồng hồ đếm giờ để phản ánh đúng deadline thật do server quy định, thay vì ước lượng ở client.</w:t>
+      </w:r>
+    </w:p>
+    <w:p>
+      <w:pPr>
+        <w:spacing w:after="20"/>
+        <w:ind w:left="200"/>
+      </w:pPr>
+      <w:r>
+        <w:rPr>
+          <w:rFonts w:ascii="Consolas" w:cs="Consolas" w:eastAsia="Consolas" w:hAnsi="Consolas"/>
+          <w:color w:val="888888"/>
+          <w:sz w:val="18"/>
+          <w:szCs w:val="18"/>
+        </w:rPr>
+        <w:t xml:space="preserve">b85eb0b  </w:t>
+      </w:r>
+      <w:r>
+        <w:rPr>
+          <w:sz w:val="20"/>
+          <w:szCs w:val="20"/>
+        </w:rPr>
+        <w:t xml:space="preserve">fix: practice timer could look frozen after tabbing away</w:t>
+      </w:r>
+    </w:p>
+    <w:p>
+      <w:pPr>
+        <w:spacing w:after="60"/>
+        <w:ind w:left="420"/>
+      </w:pPr>
+      <w:r>
+        <w:rPr>
+          <w:i/>
+          <w:iCs/>
+          <w:color w:val="444444"/>
+          <w:sz w:val="19"/>
+          <w:szCs w:val="19"/>
+        </w:rPr>
+        <w:t xml:space="preserve">→ Sửa đồng hồ có thể trông như bị treo sau khi chuyển sang tab khác rồi quay lại.</w:t>
+      </w:r>
+    </w:p>
+    <w:p>
+      <w:pPr>
+        <w:spacing w:after="20"/>
+        <w:ind w:left="200"/>
+      </w:pPr>
+      <w:r>
+        <w:rPr>
+          <w:rFonts w:ascii="Consolas" w:cs="Consolas" w:eastAsia="Consolas" w:hAnsi="Consolas"/>
+          <w:color w:val="888888"/>
+          <w:sz w:val="18"/>
+          <w:szCs w:val="18"/>
+        </w:rPr>
+        <w:t xml:space="preserve">53e38c0  </w:t>
+      </w:r>
+      <w:r>
+        <w:rPr>
+          <w:sz w:val="20"/>
+          <w:szCs w:val="20"/>
+        </w:rPr>
+        <w:t xml:space="preserve">fix: dedupe concurrent practice-session start requests</w:t>
+      </w:r>
+    </w:p>
+    <w:p>
+      <w:pPr>
+        <w:spacing w:after="60"/>
+        <w:ind w:left="420"/>
+      </w:pPr>
+      <w:r>
+        <w:rPr>
+          <w:i/>
+          <w:iCs/>
+          <w:color w:val="444444"/>
+          <w:sz w:val="19"/>
+          <w:szCs w:val="19"/>
+        </w:rPr>
+        <w:t xml:space="preserve">→ Chặn việc gửi trùng nhiều yêu cầu bắt đầu phiên luyện tập cùng lúc.</w:t>
       </w:r>
     </w:p>
     <w:p>
@@ -1030,205 +1248,197 @@
         <w:spacing w:after="100" w:before="200"/>
       </w:pPr>
       <w:r>
-        <w:t xml:space="preserve">3. Hồ sơ &amp; CV (AI parse CV)</w:t>
-      </w:r>
-    </w:p>
-    <w:p>
-      <w:pPr>
-        <w:spacing w:after="60"/>
-        <w:ind w:left="200"/>
-      </w:pPr>
-      <w:r>
-        <w:rPr>
-          <w:rFonts w:ascii="Consolas" w:cs="Consolas" w:eastAsia="Consolas" w:hAnsi="Consolas"/>
-          <w:color w:val="888888"/>
-          <w:sz w:val="18"/>
-          <w:szCs w:val="18"/>
-        </w:rPr>
-        <w:t xml:space="preserve">e671c70  </w:t>
-      </w:r>
-      <w:r>
-        <w:rPr>
-          <w:sz w:val="20"/>
-          <w:szCs w:val="20"/>
-        </w:rPr>
-        <w:t xml:space="preserve">feat: add CV upload/view/delete to the profile page</w:t>
-      </w:r>
-    </w:p>
-    <w:p>
-      <w:pPr>
-        <w:spacing w:after="60"/>
-        <w:ind w:left="200"/>
-      </w:pPr>
-      <w:r>
-        <w:rPr>
-          <w:rFonts w:ascii="Consolas" w:cs="Consolas" w:eastAsia="Consolas" w:hAnsi="Consolas"/>
-          <w:color w:val="888888"/>
-          <w:sz w:val="18"/>
-          <w:szCs w:val="18"/>
-        </w:rPr>
-        <w:t xml:space="preserve">7149f20  </w:t>
-      </w:r>
-      <w:r>
-        <w:rPr>
-          <w:sz w:val="20"/>
-          <w:szCs w:val="20"/>
-        </w:rPr>
-        <w:t xml:space="preserve">fix: CV upload showed as failed even when the file was saved</w:t>
-      </w:r>
-    </w:p>
-    <w:p>
-      <w:pPr>
-        <w:spacing w:after="60"/>
-        <w:ind w:left="200"/>
-      </w:pPr>
-      <w:r>
-        <w:rPr>
-          <w:rFonts w:ascii="Consolas" w:cs="Consolas" w:eastAsia="Consolas" w:hAnsi="Consolas"/>
-          <w:color w:val="888888"/>
-          <w:sz w:val="18"/>
-          <w:szCs w:val="18"/>
-        </w:rPr>
-        <w:t xml:space="preserve">d9d1f46  </w:t>
-      </w:r>
-      <w:r>
-        <w:rPr>
-          <w:sz w:val="20"/>
-          <w:szCs w:val="20"/>
-        </w:rPr>
-        <w:t xml:space="preserve">fix: CV upload rejected JPG/PNG that the backend now accepts</w:t>
-      </w:r>
-    </w:p>
-    <w:p>
-      <w:pPr>
-        <w:spacing w:after="60"/>
-        <w:ind w:left="200"/>
-      </w:pPr>
-      <w:r>
-        <w:rPr>
-          <w:rFonts w:ascii="Consolas" w:cs="Consolas" w:eastAsia="Consolas" w:hAnsi="Consolas"/>
-          <w:color w:val="888888"/>
-          <w:sz w:val="18"/>
-          <w:szCs w:val="18"/>
-        </w:rPr>
-        <w:t xml:space="preserve">8976472  </w:t>
-      </w:r>
-      <w:r>
-        <w:rPr>
-          <w:sz w:val="20"/>
-          <w:szCs w:val="20"/>
-        </w:rPr>
-        <w:t xml:space="preserve">fix: uploading a non-resume file left a blank, unexplained gap</w:t>
-      </w:r>
-    </w:p>
-    <w:p>
-      <w:pPr>
-        <w:spacing w:after="60"/>
-        <w:ind w:left="200"/>
-      </w:pPr>
-      <w:r>
-        <w:rPr>
-          <w:rFonts w:ascii="Consolas" w:cs="Consolas" w:eastAsia="Consolas" w:hAnsi="Consolas"/>
-          <w:color w:val="888888"/>
-          <w:sz w:val="18"/>
-          <w:szCs w:val="18"/>
-        </w:rPr>
-        <w:t xml:space="preserve">607fc6c  </w:t>
-      </w:r>
-      <w:r>
-        <w:rPr>
-          <w:sz w:val="20"/>
-          <w:szCs w:val="20"/>
-        </w:rPr>
-        <w:t xml:space="preserve">fix: CV AI summary was fetched but never shown on the profile page</w:t>
-      </w:r>
-    </w:p>
-    <w:p>
-      <w:pPr>
-        <w:spacing w:after="60"/>
-        <w:ind w:left="200"/>
-      </w:pPr>
-      <w:r>
-        <w:rPr>
-          <w:rFonts w:ascii="Consolas" w:cs="Consolas" w:eastAsia="Consolas" w:hAnsi="Consolas"/>
-          <w:color w:val="888888"/>
-          <w:sz w:val="18"/>
-          <w:szCs w:val="18"/>
-        </w:rPr>
-        <w:t xml:space="preserve">6e1db69  </w:t>
-      </w:r>
-      <w:r>
-        <w:rPr>
-          <w:sz w:val="20"/>
-          <w:szCs w:val="20"/>
-        </w:rPr>
-        <w:t xml:space="preserve">fix: Skills &amp; Expertise didn't reflect a new CV until reload</w:t>
-      </w:r>
-    </w:p>
-    <w:p>
-      <w:pPr>
-        <w:spacing w:after="60"/>
-        <w:ind w:left="200"/>
-      </w:pPr>
-      <w:r>
-        <w:rPr>
-          <w:rFonts w:ascii="Consolas" w:cs="Consolas" w:eastAsia="Consolas" w:hAnsi="Consolas"/>
-          <w:color w:val="888888"/>
-          <w:sz w:val="18"/>
-          <w:szCs w:val="18"/>
-        </w:rPr>
-        <w:t xml:space="preserve">39c0809  </w:t>
-      </w:r>
-      <w:r>
-        <w:rPr>
-          <w:sz w:val="20"/>
-          <w:szCs w:val="20"/>
-        </w:rPr>
-        <w:t xml:space="preserve">feat: add CV auto-sync toggle for profile fields</w:t>
-      </w:r>
-    </w:p>
-    <w:p>
-      <w:pPr>
-        <w:spacing w:after="60"/>
-        <w:ind w:left="200"/>
-      </w:pPr>
-      <w:r>
-        <w:rPr>
-          <w:rFonts w:ascii="Consolas" w:cs="Consolas" w:eastAsia="Consolas" w:hAnsi="Consolas"/>
-          <w:color w:val="888888"/>
-          <w:sz w:val="18"/>
-          <w:szCs w:val="18"/>
-        </w:rPr>
-        <w:t xml:space="preserve">b2e736f  </w:t>
-      </w:r>
-      <w:r>
-        <w:rPr>
-          <w:sz w:val="20"/>
-          <w:szCs w:val="20"/>
-        </w:rPr>
-        <w:t xml:space="preserve">feat: add full-size CV image preview with lightbox</w:t>
-      </w:r>
-    </w:p>
-    <w:p>
-      <w:pPr>
-        <w:spacing w:after="60"/>
-        <w:ind w:left="200"/>
-      </w:pPr>
-      <w:r>
-        <w:rPr>
-          <w:rFonts w:ascii="Consolas" w:cs="Consolas" w:eastAsia="Consolas" w:hAnsi="Consolas"/>
-          <w:color w:val="888888"/>
-          <w:sz w:val="18"/>
-          <w:szCs w:val="18"/>
-        </w:rPr>
-        <w:t xml:space="preserve">68d567c  </w:t>
-      </w:r>
-      <w:r>
-        <w:rPr>
-          <w:sz w:val="20"/>
-          <w:szCs w:val="20"/>
-        </w:rPr>
-        <w:t xml:space="preserve">feat: validate LinkedIn/GitHub URLs before saving</w:t>
+        <w:t xml:space="preserve">2. Chấm điểm AI &amp; trang kết quả (Feedback)</w:t>
+      </w:r>
+    </w:p>
+    <w:p>
+      <w:pPr>
+        <w:spacing w:after="20"/>
+        <w:ind w:left="200"/>
+      </w:pPr>
+      <w:r>
+        <w:rPr>
+          <w:rFonts w:ascii="Consolas" w:cs="Consolas" w:eastAsia="Consolas" w:hAnsi="Consolas"/>
+          <w:color w:val="888888"/>
+          <w:sz w:val="18"/>
+          <w:szCs w:val="18"/>
+        </w:rPr>
+        <w:t xml:space="preserve">5be07a7  </w:t>
+      </w:r>
+      <w:r>
+        <w:rPr>
+          <w:sz w:val="20"/>
+          <w:szCs w:val="20"/>
+        </w:rPr>
+        <w:t xml:space="preserve">feat: capture per-question AI evaluation, add skill radar chart</w:t>
+      </w:r>
+    </w:p>
+    <w:p>
+      <w:pPr>
+        <w:spacing w:after="60"/>
+        <w:ind w:left="420"/>
+      </w:pPr>
+      <w:r>
+        <w:rPr>
+          <w:i/>
+          <w:iCs/>
+          <w:color w:val="444444"/>
+          <w:sz w:val="19"/>
+          <w:szCs w:val="19"/>
+        </w:rPr>
+        <w:t xml:space="preserve">→ Lưu đánh giá AI theo từng câu hỏi, thêm biểu đồ radar kỹ năng.</w:t>
+      </w:r>
+    </w:p>
+    <w:p>
+      <w:pPr>
+        <w:spacing w:after="20"/>
+        <w:ind w:left="200"/>
+      </w:pPr>
+      <w:r>
+        <w:rPr>
+          <w:rFonts w:ascii="Consolas" w:cs="Consolas" w:eastAsia="Consolas" w:hAnsi="Consolas"/>
+          <w:color w:val="888888"/>
+          <w:sz w:val="18"/>
+          <w:szCs w:val="18"/>
+        </w:rPr>
+        <w:t xml:space="preserve">3a44bb9  </w:t>
+      </w:r>
+      <w:r>
+        <w:rPr>
+          <w:sz w:val="20"/>
+          <w:szCs w:val="20"/>
+        </w:rPr>
+        <w:t xml:space="preserve">feat: show real per-question AI feedback on the result page</w:t>
+      </w:r>
+    </w:p>
+    <w:p>
+      <w:pPr>
+        <w:spacing w:after="60"/>
+        <w:ind w:left="420"/>
+      </w:pPr>
+      <w:r>
+        <w:rPr>
+          <w:i/>
+          <w:iCs/>
+          <w:color w:val="444444"/>
+          <w:sz w:val="19"/>
+          <w:szCs w:val="19"/>
+        </w:rPr>
+        <w:t xml:space="preserve">→ Hiện đánh giá AI thật cho từng câu hỏi trên trang kết quả, thay dữ liệu giả trước đó.</w:t>
+      </w:r>
+    </w:p>
+    <w:p>
+      <w:pPr>
+        <w:spacing w:after="20"/>
+        <w:ind w:left="200"/>
+      </w:pPr>
+      <w:r>
+        <w:rPr>
+          <w:rFonts w:ascii="Consolas" w:cs="Consolas" w:eastAsia="Consolas" w:hAnsi="Consolas"/>
+          <w:color w:val="888888"/>
+          <w:sz w:val="18"/>
+          <w:szCs w:val="18"/>
+        </w:rPr>
+        <w:t xml:space="preserve">d61d45d  </w:t>
+      </w:r>
+      <w:r>
+        <w:rPr>
+          <w:sz w:val="20"/>
+          <w:szCs w:val="20"/>
+        </w:rPr>
+        <w:t xml:space="preserve">feat: use persisted feedback endpoint, add overall AI insight</w:t>
+      </w:r>
+    </w:p>
+    <w:p>
+      <w:pPr>
+        <w:spacing w:after="60"/>
+        <w:ind w:left="420"/>
+      </w:pPr>
+      <w:r>
+        <w:rPr>
+          <w:i/>
+          <w:iCs/>
+          <w:color w:val="444444"/>
+          <w:sz w:val="19"/>
+          <w:szCs w:val="19"/>
+        </w:rPr>
+        <w:t xml:space="preserve">→ Dùng endpoint lưu trữ đánh giá lâu dài, thêm nhận xét tổng thể (overall insight) từ AI.</w:t>
+      </w:r>
+    </w:p>
+    <w:p>
+      <w:pPr>
+        <w:spacing w:after="20"/>
+        <w:ind w:left="200"/>
+      </w:pPr>
+      <w:r>
+        <w:rPr>
+          <w:rFonts w:ascii="Consolas" w:cs="Consolas" w:eastAsia="Consolas" w:hAnsi="Consolas"/>
+          <w:color w:val="888888"/>
+          <w:sz w:val="18"/>
+          <w:szCs w:val="18"/>
+        </w:rPr>
+        <w:t xml:space="preserve">9be9ef5  </w:t>
+      </w:r>
+      <w:r>
+        <w:rPr>
+          <w:sz w:val="20"/>
+          <w:szCs w:val="20"/>
+        </w:rPr>
+        <w:t xml:space="preserve">fix: rating showed a raw 0-10 BE value next to 5 stars</w:t>
+      </w:r>
+    </w:p>
+    <w:p>
+      <w:pPr>
+        <w:spacing w:after="60"/>
+        <w:ind w:left="420"/>
+      </w:pPr>
+      <w:r>
+        <w:rPr>
+          <w:i/>
+          <w:iCs/>
+          <w:color w:val="444444"/>
+          <w:sz w:val="19"/>
+          <w:szCs w:val="19"/>
+        </w:rPr>
+        <w:t xml:space="preserve">→ Sửa lỗi hiển thị điểm đánh giá thang 0–10 thô cạnh biểu tượng 5 sao, gây hiểu sai thang điểm.</w:t>
+      </w:r>
+    </w:p>
+    <w:p>
+      <w:pPr>
+        <w:spacing w:after="20"/>
+        <w:ind w:left="200"/>
+      </w:pPr>
+      <w:r>
+        <w:rPr>
+          <w:rFonts w:ascii="Consolas" w:cs="Consolas" w:eastAsia="Consolas" w:hAnsi="Consolas"/>
+          <w:color w:val="888888"/>
+          <w:sz w:val="18"/>
+          <w:szCs w:val="18"/>
+        </w:rPr>
+        <w:t xml:space="preserve">fca2a22  </w:t>
+      </w:r>
+      <w:r>
+        <w:rPr>
+          <w:sz w:val="20"/>
+          <w:szCs w:val="20"/>
+        </w:rPr>
+        <w:t xml:space="preserve">feat: clearer pending-score UI, skeleton loading, and small fixes</w:t>
+      </w:r>
+    </w:p>
+    <w:p>
+      <w:pPr>
+        <w:spacing w:after="60"/>
+        <w:ind w:left="420"/>
+      </w:pPr>
+      <w:r>
+        <w:rPr>
+          <w:i/>
+          <w:iCs/>
+          <w:color w:val="444444"/>
+          <w:sz w:val="19"/>
+          <w:szCs w:val="19"/>
+        </w:rPr>
+        <w:t xml:space="preserve">→ Làm rõ giao diện khi điểm đang chờ chấm, thêm skeleton loading và vài sửa nhỏ khác.</w:t>
       </w:r>
     </w:p>
     <w:p>
@@ -1237,12 +1447,363 @@
         <w:spacing w:after="100" w:before="200"/>
       </w:pPr>
       <w:r>
+        <w:t xml:space="preserve">3. Hồ sơ &amp; CV (AI parse CV)</w:t>
+      </w:r>
+    </w:p>
+    <w:p>
+      <w:pPr>
+        <w:spacing w:after="20"/>
+        <w:ind w:left="200"/>
+      </w:pPr>
+      <w:r>
+        <w:rPr>
+          <w:rFonts w:ascii="Consolas" w:cs="Consolas" w:eastAsia="Consolas" w:hAnsi="Consolas"/>
+          <w:color w:val="888888"/>
+          <w:sz w:val="18"/>
+          <w:szCs w:val="18"/>
+        </w:rPr>
+        <w:t xml:space="preserve">e671c70  </w:t>
+      </w:r>
+      <w:r>
+        <w:rPr>
+          <w:sz w:val="20"/>
+          <w:szCs w:val="20"/>
+        </w:rPr>
+        <w:t xml:space="preserve">feat: add CV upload/view/delete to the profile page</w:t>
+      </w:r>
+    </w:p>
+    <w:p>
+      <w:pPr>
+        <w:spacing w:after="60"/>
+        <w:ind w:left="420"/>
+      </w:pPr>
+      <w:r>
+        <w:rPr>
+          <w:i/>
+          <w:iCs/>
+          <w:color w:val="444444"/>
+          <w:sz w:val="19"/>
+          <w:szCs w:val="19"/>
+        </w:rPr>
+        <w:t xml:space="preserve">→ Thêm chức năng tải lên, xem, xóa CV ở trang hồ sơ.</w:t>
+      </w:r>
+    </w:p>
+    <w:p>
+      <w:pPr>
+        <w:spacing w:after="20"/>
+        <w:ind w:left="200"/>
+      </w:pPr>
+      <w:r>
+        <w:rPr>
+          <w:rFonts w:ascii="Consolas" w:cs="Consolas" w:eastAsia="Consolas" w:hAnsi="Consolas"/>
+          <w:color w:val="888888"/>
+          <w:sz w:val="18"/>
+          <w:szCs w:val="18"/>
+        </w:rPr>
+        <w:t xml:space="preserve">7149f20  </w:t>
+      </w:r>
+      <w:r>
+        <w:rPr>
+          <w:sz w:val="20"/>
+          <w:szCs w:val="20"/>
+        </w:rPr>
+        <w:t xml:space="preserve">fix: CV upload showed as failed even when the file was saved</w:t>
+      </w:r>
+    </w:p>
+    <w:p>
+      <w:pPr>
+        <w:spacing w:after="60"/>
+        <w:ind w:left="420"/>
+      </w:pPr>
+      <w:r>
+        <w:rPr>
+          <w:i/>
+          <w:iCs/>
+          <w:color w:val="444444"/>
+          <w:sz w:val="19"/>
+          <w:szCs w:val="19"/>
+        </w:rPr>
+        <w:t xml:space="preserve">→ Sửa lỗi báo “tải lên thất bại” dù file thực ra đã được lưu thành công.</w:t>
+      </w:r>
+    </w:p>
+    <w:p>
+      <w:pPr>
+        <w:spacing w:after="20"/>
+        <w:ind w:left="200"/>
+      </w:pPr>
+      <w:r>
+        <w:rPr>
+          <w:rFonts w:ascii="Consolas" w:cs="Consolas" w:eastAsia="Consolas" w:hAnsi="Consolas"/>
+          <w:color w:val="888888"/>
+          <w:sz w:val="18"/>
+          <w:szCs w:val="18"/>
+        </w:rPr>
+        <w:t xml:space="preserve">d9d1f46  </w:t>
+      </w:r>
+      <w:r>
+        <w:rPr>
+          <w:sz w:val="20"/>
+          <w:szCs w:val="20"/>
+        </w:rPr>
+        <w:t xml:space="preserve">fix: CV upload rejected JPG/PNG that the backend now accepts</w:t>
+      </w:r>
+    </w:p>
+    <w:p>
+      <w:pPr>
+        <w:spacing w:after="60"/>
+        <w:ind w:left="420"/>
+      </w:pPr>
+      <w:r>
+        <w:rPr>
+          <w:i/>
+          <w:iCs/>
+          <w:color w:val="444444"/>
+          <w:sz w:val="19"/>
+          <w:szCs w:val="19"/>
+        </w:rPr>
+        <w:t xml:space="preserve">→ Sửa lỗi từ chối file JPG/PNG dù backend đã hỗ trợ định dạng này.</w:t>
+      </w:r>
+    </w:p>
+    <w:p>
+      <w:pPr>
+        <w:spacing w:after="20"/>
+        <w:ind w:left="200"/>
+      </w:pPr>
+      <w:r>
+        <w:rPr>
+          <w:rFonts w:ascii="Consolas" w:cs="Consolas" w:eastAsia="Consolas" w:hAnsi="Consolas"/>
+          <w:color w:val="888888"/>
+          <w:sz w:val="18"/>
+          <w:szCs w:val="18"/>
+        </w:rPr>
+        <w:t xml:space="preserve">8976472  </w:t>
+      </w:r>
+      <w:r>
+        <w:rPr>
+          <w:sz w:val="20"/>
+          <w:szCs w:val="20"/>
+        </w:rPr>
+        <w:t xml:space="preserve">fix: uploading a non-resume file left a blank, unexplained gap</w:t>
+      </w:r>
+    </w:p>
+    <w:p>
+      <w:pPr>
+        <w:spacing w:after="60"/>
+        <w:ind w:left="420"/>
+      </w:pPr>
+      <w:r>
+        <w:rPr>
+          <w:i/>
+          <w:iCs/>
+          <w:color w:val="444444"/>
+          <w:sz w:val="19"/>
+          <w:szCs w:val="19"/>
+        </w:rPr>
+        <w:t xml:space="preserve">→ Sửa lỗi khi tải lên file không phải CV để lại một khoảng trống không rõ nguyên nhân trên giao diện.</w:t>
+      </w:r>
+    </w:p>
+    <w:p>
+      <w:pPr>
+        <w:spacing w:after="20"/>
+        <w:ind w:left="200"/>
+      </w:pPr>
+      <w:r>
+        <w:rPr>
+          <w:rFonts w:ascii="Consolas" w:cs="Consolas" w:eastAsia="Consolas" w:hAnsi="Consolas"/>
+          <w:color w:val="888888"/>
+          <w:sz w:val="18"/>
+          <w:szCs w:val="18"/>
+        </w:rPr>
+        <w:t xml:space="preserve">607fc6c  </w:t>
+      </w:r>
+      <w:r>
+        <w:rPr>
+          <w:sz w:val="20"/>
+          <w:szCs w:val="20"/>
+        </w:rPr>
+        <w:t xml:space="preserve">fix: CV AI summary was fetched but never shown on the profile page</w:t>
+      </w:r>
+    </w:p>
+    <w:p>
+      <w:pPr>
+        <w:spacing w:after="60"/>
+        <w:ind w:left="420"/>
+      </w:pPr>
+      <w:r>
+        <w:rPr>
+          <w:i/>
+          <w:iCs/>
+          <w:color w:val="444444"/>
+          <w:sz w:val="19"/>
+          <w:szCs w:val="19"/>
+        </w:rPr>
+        <w:t xml:space="preserve">→ Sửa lỗi tóm tắt AI của CV đã được gọi về nhưng chưa từng hiển thị ra trang hồ sơ.</w:t>
+      </w:r>
+    </w:p>
+    <w:p>
+      <w:pPr>
+        <w:spacing w:after="20"/>
+        <w:ind w:left="200"/>
+      </w:pPr>
+      <w:r>
+        <w:rPr>
+          <w:rFonts w:ascii="Consolas" w:cs="Consolas" w:eastAsia="Consolas" w:hAnsi="Consolas"/>
+          <w:color w:val="888888"/>
+          <w:sz w:val="18"/>
+          <w:szCs w:val="18"/>
+        </w:rPr>
+        <w:t xml:space="preserve">6e1db69  </w:t>
+      </w:r>
+      <w:r>
+        <w:rPr>
+          <w:sz w:val="20"/>
+          <w:szCs w:val="20"/>
+        </w:rPr>
+        <w:t xml:space="preserve">fix: Skills &amp; Expertise didn't reflect a new CV until reload</w:t>
+      </w:r>
+    </w:p>
+    <w:p>
+      <w:pPr>
+        <w:spacing w:after="60"/>
+        <w:ind w:left="420"/>
+      </w:pPr>
+      <w:r>
+        <w:rPr>
+          <w:i/>
+          <w:iCs/>
+          <w:color w:val="444444"/>
+          <w:sz w:val="19"/>
+          <w:szCs w:val="19"/>
+        </w:rPr>
+        <w:t xml:space="preserve">→ Sửa lỗi mục Kỹ năng không cập nhật theo CV mới cho tới khi tải lại trang.</w:t>
+      </w:r>
+    </w:p>
+    <w:p>
+      <w:pPr>
+        <w:spacing w:after="20"/>
+        <w:ind w:left="200"/>
+      </w:pPr>
+      <w:r>
+        <w:rPr>
+          <w:rFonts w:ascii="Consolas" w:cs="Consolas" w:eastAsia="Consolas" w:hAnsi="Consolas"/>
+          <w:color w:val="888888"/>
+          <w:sz w:val="18"/>
+          <w:szCs w:val="18"/>
+        </w:rPr>
+        <w:t xml:space="preserve">39c0809  </w:t>
+      </w:r>
+      <w:r>
+        <w:rPr>
+          <w:sz w:val="20"/>
+          <w:szCs w:val="20"/>
+        </w:rPr>
+        <w:t xml:space="preserve">feat: add CV auto-sync toggle for profile fields</w:t>
+      </w:r>
+    </w:p>
+    <w:p>
+      <w:pPr>
+        <w:spacing w:after="60"/>
+        <w:ind w:left="420"/>
+      </w:pPr>
+      <w:r>
+        <w:rPr>
+          <w:i/>
+          <w:iCs/>
+          <w:color w:val="444444"/>
+          <w:sz w:val="19"/>
+          <w:szCs w:val="19"/>
+        </w:rPr>
+        <w:t xml:space="preserve">→ Thêm công tắc tự động đồng bộ các trường hồ sơ theo CV mới tải lên.</w:t>
+      </w:r>
+    </w:p>
+    <w:p>
+      <w:pPr>
+        <w:spacing w:after="20"/>
+        <w:ind w:left="200"/>
+      </w:pPr>
+      <w:r>
+        <w:rPr>
+          <w:rFonts w:ascii="Consolas" w:cs="Consolas" w:eastAsia="Consolas" w:hAnsi="Consolas"/>
+          <w:color w:val="888888"/>
+          <w:sz w:val="18"/>
+          <w:szCs w:val="18"/>
+        </w:rPr>
+        <w:t xml:space="preserve">b2e736f  </w:t>
+      </w:r>
+      <w:r>
+        <w:rPr>
+          <w:sz w:val="20"/>
+          <w:szCs w:val="20"/>
+        </w:rPr>
+        <w:t xml:space="preserve">feat: add full-size CV image preview with lightbox</w:t>
+      </w:r>
+    </w:p>
+    <w:p>
+      <w:pPr>
+        <w:spacing w:after="60"/>
+        <w:ind w:left="420"/>
+      </w:pPr>
+      <w:r>
+        <w:rPr>
+          <w:i/>
+          <w:iCs/>
+          <w:color w:val="444444"/>
+          <w:sz w:val="19"/>
+          <w:szCs w:val="19"/>
+        </w:rPr>
+        <w:t xml:space="preserve">→ Thêm xem trước ảnh CV cỡ đầy đủ dạng lightbox.</w:t>
+      </w:r>
+    </w:p>
+    <w:p>
+      <w:pPr>
+        <w:spacing w:after="20"/>
+        <w:ind w:left="200"/>
+      </w:pPr>
+      <w:r>
+        <w:rPr>
+          <w:rFonts w:ascii="Consolas" w:cs="Consolas" w:eastAsia="Consolas" w:hAnsi="Consolas"/>
+          <w:color w:val="888888"/>
+          <w:sz w:val="18"/>
+          <w:szCs w:val="18"/>
+        </w:rPr>
+        <w:t xml:space="preserve">68d567c  </w:t>
+      </w:r>
+      <w:r>
+        <w:rPr>
+          <w:sz w:val="20"/>
+          <w:szCs w:val="20"/>
+        </w:rPr>
+        <w:t xml:space="preserve">feat: validate LinkedIn/GitHub URLs before saving</w:t>
+      </w:r>
+    </w:p>
+    <w:p>
+      <w:pPr>
+        <w:spacing w:after="60"/>
+        <w:ind w:left="420"/>
+      </w:pPr>
+      <w:r>
+        <w:rPr>
+          <w:i/>
+          <w:iCs/>
+          <w:color w:val="444444"/>
+          <w:sz w:val="19"/>
+          <w:szCs w:val="19"/>
+        </w:rPr>
+        <w:t xml:space="preserve">→ Thêm kiểm tra định dạng URL LinkedIn/GitHub trước khi lưu.</w:t>
+      </w:r>
+    </w:p>
+    <w:p>
+      <w:pPr>
+        <w:pStyle w:val="Heading3"/>
+        <w:spacing w:after="100" w:before="200"/>
+      </w:pPr>
+      <w:r>
         <w:t xml:space="preserve">4. Dashboard, lịch sử luyện tập, mời phỏng vấn</w:t>
       </w:r>
     </w:p>
     <w:p>
       <w:pPr>
-        <w:spacing w:after="60"/>
+        <w:spacing w:after="20"/>
         <w:ind w:left="200"/>
       </w:pPr>
       <w:r>
@@ -1265,6 +1826,22 @@
     <w:p>
       <w:pPr>
         <w:spacing w:after="60"/>
+        <w:ind w:left="420"/>
+      </w:pPr>
+      <w:r>
+        <w:rPr>
+          <w:i/>
+          <w:iCs/>
+          <w:color w:val="444444"/>
+          <w:sz w:val="19"/>
+          <w:szCs w:val="19"/>
+        </w:rPr>
+        <w:t xml:space="preserve">→ Sửa lỗi trang hồ sơ hiển thị số liệu thống kê và thành tích hoàn toàn giả.</w:t>
+      </w:r>
+    </w:p>
+    <w:p>
+      <w:pPr>
+        <w:spacing w:after="20"/>
         <w:ind w:left="200"/>
       </w:pPr>
       <w:r>
@@ -1287,6 +1864,22 @@
     <w:p>
       <w:pPr>
         <w:spacing w:after="60"/>
+        <w:ind w:left="420"/>
+      </w:pPr>
+      <w:r>
+        <w:rPr>
+          <w:i/>
+          <w:iCs/>
+          <w:color w:val="444444"/>
+          <w:sz w:val="19"/>
+          <w:szCs w:val="19"/>
+        </w:rPr>
+        <w:t xml:space="preserve">→ Sửa lỗi dashboard hiển thị nhận định kỹ năng bịa như thể là kết quả AI thật.</w:t>
+      </w:r>
+    </w:p>
+    <w:p>
+      <w:pPr>
+        <w:spacing w:after="20"/>
         <w:ind w:left="200"/>
       </w:pPr>
       <w:r>
@@ -1309,6 +1902,22 @@
     <w:p>
       <w:pPr>
         <w:spacing w:after="60"/>
+        <w:ind w:left="420"/>
+      </w:pPr>
+      <w:r>
+        <w:rPr>
+          <w:i/>
+          <w:iCs/>
+          <w:color w:val="444444"/>
+          <w:sz w:val="19"/>
+          <w:szCs w:val="19"/>
+        </w:rPr>
+        <w:t xml:space="preserve">→ Hiện điểm luyện tập gần nhất trên trang Lịch sử.</w:t>
+      </w:r>
+    </w:p>
+    <w:p>
+      <w:pPr>
+        <w:spacing w:after="20"/>
         <w:ind w:left="200"/>
       </w:pPr>
       <w:r>
@@ -1331,6 +1940,22 @@
     <w:p>
       <w:pPr>
         <w:spacing w:after="60"/>
+        <w:ind w:left="420"/>
+      </w:pPr>
+      <w:r>
+        <w:rPr>
+          <w:i/>
+          <w:iCs/>
+          <w:color w:val="444444"/>
+          <w:sz w:val="19"/>
+          <w:szCs w:val="19"/>
+        </w:rPr>
+        <w:t xml:space="preserve">→ Sửa lỗi huy hiệu số lượng ở mục Lịch sử trên sidebar bị gắn cứng, không cập nhật thật.</w:t>
+      </w:r>
+    </w:p>
+    <w:p>
+      <w:pPr>
+        <w:spacing w:after="20"/>
         <w:ind w:left="200"/>
       </w:pPr>
       <w:r>
@@ -1353,6 +1978,22 @@
     <w:p>
       <w:pPr>
         <w:spacing w:after="60"/>
+        <w:ind w:left="420"/>
+      </w:pPr>
+      <w:r>
+        <w:rPr>
+          <w:i/>
+          <w:iCs/>
+          <w:color w:val="444444"/>
+          <w:sz w:val="19"/>
+          <w:szCs w:val="19"/>
+        </w:rPr>
+        <w:t xml:space="preserve">→ Thêm hộp thư lời mời phỏng vấn, cho phép chấp nhận/từ chối.</w:t>
+      </w:r>
+    </w:p>
+    <w:p>
+      <w:pPr>
+        <w:spacing w:after="20"/>
         <w:ind w:left="200"/>
       </w:pPr>
       <w:r>
@@ -1375,6 +2016,22 @@
     <w:p>
       <w:pPr>
         <w:spacing w:after="60"/>
+        <w:ind w:left="420"/>
+      </w:pPr>
+      <w:r>
+        <w:rPr>
+          <w:i/>
+          <w:iCs/>
+          <w:color w:val="444444"/>
+          <w:sz w:val="19"/>
+          <w:szCs w:val="19"/>
+        </w:rPr>
+        <w:t xml:space="preserve">→ Cho phép ứng viên gửi kèm lời nhắn/số điện thoại khi chấp nhận lời mời.</w:t>
+      </w:r>
+    </w:p>
+    <w:p>
+      <w:pPr>
+        <w:spacing w:after="20"/>
         <w:ind w:left="200"/>
       </w:pPr>
       <w:r>
@@ -1397,6 +2054,22 @@
     <w:p>
       <w:pPr>
         <w:spacing w:after="60"/>
+        <w:ind w:left="420"/>
+      </w:pPr>
+      <w:r>
+        <w:rPr>
+          <w:i/>
+          <w:iCs/>
+          <w:color w:val="444444"/>
+          <w:sz w:val="19"/>
+          <w:szCs w:val="19"/>
+        </w:rPr>
+        <w:t xml:space="preserve">→ Cho phép ứng viên tắt việc được gợi ý tới nhà tuyển dụng.</w:t>
+      </w:r>
+    </w:p>
+    <w:p>
+      <w:pPr>
+        <w:spacing w:after="20"/>
         <w:ind w:left="200"/>
       </w:pPr>
       <w:r>
@@ -1419,6 +2092,22 @@
     <w:p>
       <w:pPr>
         <w:spacing w:after="60"/>
+        <w:ind w:left="420"/>
+      </w:pPr>
+      <w:r>
+        <w:rPr>
+          <w:i/>
+          <w:iCs/>
+          <w:color w:val="444444"/>
+          <w:sz w:val="19"/>
+          <w:szCs w:val="19"/>
+        </w:rPr>
+        <w:t xml:space="preserve">→ Thêm bộ lọc theo kỹ năng, thông báo resume, dữ liệu lịch sử/dashboard thật.</w:t>
+      </w:r>
+    </w:p>
+    <w:p>
+      <w:pPr>
+        <w:spacing w:after="20"/>
         <w:ind w:left="200"/>
       </w:pPr>
       <w:r>
@@ -1436,6 +2125,22 @@
           <w:szCs w:val="20"/>
         </w:rPr>
         <w:t xml:space="preserve">feat: wire real BE for candidate/HR flows, fix sequencing gaps, add saved sets</w:t>
+      </w:r>
+    </w:p>
+    <w:p>
+      <w:pPr>
+        <w:spacing w:after="60"/>
+        <w:ind w:left="420"/>
+      </w:pPr>
+      <w:r>
+        <w:rPr>
+          <w:i/>
+          <w:iCs/>
+          <w:color w:val="444444"/>
+          <w:sz w:val="19"/>
+          <w:szCs w:val="19"/>
+        </w:rPr>
+        <w:t xml:space="preserve">→ Nối luồng candidate/HR với backend thật, sửa các lỗi thứ tự xử lý, thêm chức năng lưu bộ câu hỏi yêu thích (Saved Sets).</w:t>
       </w:r>
     </w:p>
     <w:p>
@@ -1484,7 +2189,7 @@
     </w:p>
     <w:p>
       <w:pPr>
-        <w:spacing w:after="60"/>
+        <w:spacing w:after="20"/>
         <w:ind w:left="200"/>
       </w:pPr>
       <w:r>
@@ -1507,6 +2212,22 @@
     <w:p>
       <w:pPr>
         <w:spacing w:after="60"/>
+        <w:ind w:left="420"/>
+      </w:pPr>
+      <w:r>
+        <w:rPr>
+          <w:i/>
+          <w:iCs/>
+          <w:color w:val="444444"/>
+          <w:sz w:val="19"/>
+          <w:szCs w:val="19"/>
+        </w:rPr>
+        <w:t xml:space="preserve">→ Thêm luồng sinh câu hỏi đời đầu tích hợp RAG, kèm màn hình xem lại kết quả.</w:t>
+      </w:r>
+    </w:p>
+    <w:p>
+      <w:pPr>
+        <w:spacing w:after="20"/>
         <w:ind w:left="200"/>
       </w:pPr>
       <w:r>
@@ -1529,6 +2250,22 @@
     <w:p>
       <w:pPr>
         <w:spacing w:after="60"/>
+        <w:ind w:left="420"/>
+      </w:pPr>
+      <w:r>
+        <w:rPr>
+          <w:i/>
+          <w:iCs/>
+          <w:color w:val="444444"/>
+          <w:sz w:val="19"/>
+          <w:szCs w:val="19"/>
+        </w:rPr>
+        <w:t xml:space="preserve">→ Tái cấu trúc luồng sinh câu hỏi với chỉ báo từng bước (step indicator) và cho phép sửa plan.</w:t>
+      </w:r>
+    </w:p>
+    <w:p>
+      <w:pPr>
+        <w:spacing w:after="20"/>
         <w:ind w:left="200"/>
       </w:pPr>
       <w:r>
@@ -1551,6 +2288,22 @@
     <w:p>
       <w:pPr>
         <w:spacing w:after="60"/>
+        <w:ind w:left="420"/>
+      </w:pPr>
+      <w:r>
+        <w:rPr>
+          <w:i/>
+          <w:iCs/>
+          <w:color w:val="444444"/>
+          <w:sz w:val="19"/>
+          <w:szCs w:val="19"/>
+        </w:rPr>
+        <w:t xml:space="preserve">→ Chuyển sang polling trạng thái do backend điều khiển, tích hợp với trang lịch sử.</w:t>
+      </w:r>
+    </w:p>
+    <w:p>
+      <w:pPr>
+        <w:spacing w:after="20"/>
         <w:ind w:left="200"/>
       </w:pPr>
       <w:r>
@@ -1573,6 +2326,22 @@
     <w:p>
       <w:pPr>
         <w:spacing w:after="60"/>
+        <w:ind w:left="420"/>
+      </w:pPr>
+      <w:r>
+        <w:rPr>
+          <w:i/>
+          <w:iCs/>
+          <w:color w:val="444444"/>
+          <w:sz w:val="19"/>
+          <w:szCs w:val="19"/>
+        </w:rPr>
+        <w:t xml:space="preserve">→ Thêm chức năng xóa và xuất Excel cho các kế hoạch câu hỏi (question plans).</w:t>
+      </w:r>
+    </w:p>
+    <w:p>
+      <w:pPr>
+        <w:spacing w:after="20"/>
         <w:ind w:left="200"/>
       </w:pPr>
       <w:r>
@@ -1595,6 +2364,22 @@
     <w:p>
       <w:pPr>
         <w:spacing w:after="60"/>
+        <w:ind w:left="420"/>
+      </w:pPr>
+      <w:r>
+        <w:rPr>
+          <w:i/>
+          <w:iCs/>
+          <w:color w:val="444444"/>
+          <w:sz w:val="19"/>
+          <w:szCs w:val="19"/>
+        </w:rPr>
+        <w:t xml:space="preserve">→ Thêm Studio — luồng sinh câu hỏi bằng AI thiết kế lại, thay thế luồng generation đời đầu.</w:t>
+      </w:r>
+    </w:p>
+    <w:p>
+      <w:pPr>
+        <w:spacing w:after="20"/>
         <w:ind w:left="200"/>
       </w:pPr>
       <w:r>
@@ -1617,6 +2402,22 @@
     <w:p>
       <w:pPr>
         <w:spacing w:after="60"/>
+        <w:ind w:left="420"/>
+      </w:pPr>
+      <w:r>
+        <w:rPr>
+          <w:i/>
+          <w:iCs/>
+          <w:color w:val="444444"/>
+          <w:sz w:val="19"/>
+          <w:szCs w:val="19"/>
+        </w:rPr>
+        <w:t xml:space="preserve">→ Hỗ trợ tiêu chí chấm điểm (rubric) và huy hiệu “nguồn gốc Studio” trong luồng cũ.</w:t>
+      </w:r>
+    </w:p>
+    <w:p>
+      <w:pPr>
+        <w:spacing w:after="20"/>
         <w:ind w:left="200"/>
       </w:pPr>
       <w:r>
@@ -1639,6 +2440,22 @@
     <w:p>
       <w:pPr>
         <w:spacing w:after="60"/>
+        <w:ind w:left="420"/>
+      </w:pPr>
+      <w:r>
+        <w:rPr>
+          <w:i/>
+          <w:iCs/>
+          <w:color w:val="444444"/>
+          <w:sz w:val="19"/>
+          <w:szCs w:val="19"/>
+        </w:rPr>
+        <w:t xml:space="preserve">→ Chuyển huy hiệu tiến trình sinh câu hỏi từ polling mỗi 800ms sang cập nhật theo sự kiện, giảm request thừa.</w:t>
+      </w:r>
+    </w:p>
+    <w:p>
+      <w:pPr>
+        <w:spacing w:after="20"/>
         <w:ind w:left="200"/>
       </w:pPr>
       <w:r>
@@ -1661,6 +2478,22 @@
     <w:p>
       <w:pPr>
         <w:spacing w:after="60"/>
+        <w:ind w:left="420"/>
+      </w:pPr>
+      <w:r>
+        <w:rPr>
+          <w:i/>
+          <w:iCs/>
+          <w:color w:val="444444"/>
+          <w:sz w:val="19"/>
+          <w:szCs w:val="19"/>
+        </w:rPr>
+        <w:t xml:space="preserve">→ Sửa lỗi hiện hộp thoại hết quota ngay cả khi đang có một lượt sinh câu hỏi khác chạy dở.</w:t>
+      </w:r>
+    </w:p>
+    <w:p>
+      <w:pPr>
+        <w:spacing w:after="20"/>
         <w:ind w:left="200"/>
       </w:pPr>
       <w:r>
@@ -1683,6 +2516,22 @@
     <w:p>
       <w:pPr>
         <w:spacing w:after="60"/>
+        <w:ind w:left="420"/>
+      </w:pPr>
+      <w:r>
+        <w:rPr>
+          <w:i/>
+          <w:iCs/>
+          <w:color w:val="444444"/>
+          <w:sz w:val="19"/>
+          <w:szCs w:val="19"/>
+        </w:rPr>
+        <w:t xml:space="preserve">→ Sửa lỗi nghiêm trọng: sửa một bộ câu hỏi không thực sự cập nhật dữ liệu đã publish.</w:t>
+      </w:r>
+    </w:p>
+    <w:p>
+      <w:pPr>
+        <w:spacing w:after="20"/>
         <w:ind w:left="200"/>
       </w:pPr>
       <w:r>
@@ -1700,6 +2549,22 @@
           <w:szCs w:val="20"/>
         </w:rPr>
         <w:t xml:space="preserve">fix: Knowledge Documents list silently truncated at 20 items</w:t>
+      </w:r>
+    </w:p>
+    <w:p>
+      <w:pPr>
+        <w:spacing w:after="60"/>
+        <w:ind w:left="420"/>
+      </w:pPr>
+      <w:r>
+        <w:rPr>
+          <w:i/>
+          <w:iCs/>
+          <w:color w:val="444444"/>
+          <w:sz w:val="19"/>
+          <w:szCs w:val="19"/>
+        </w:rPr>
+        <w:t xml:space="preserve">→ Sửa lỗi danh sách tài liệu Knowledge Base bị cắt ngầm ở 20 mục.</w:t>
       </w:r>
     </w:p>
     <w:p>
@@ -1722,7 +2587,7 @@
     </w:p>
     <w:p>
       <w:pPr>
-        <w:spacing w:after="60"/>
+        <w:spacing w:after="20"/>
         <w:ind w:left="200"/>
       </w:pPr>
       <w:r>
@@ -1745,6 +2610,22 @@
     <w:p>
       <w:pPr>
         <w:spacing w:after="60"/>
+        <w:ind w:left="420"/>
+      </w:pPr>
+      <w:r>
+        <w:rPr>
+          <w:i/>
+          <w:iCs/>
+          <w:color w:val="444444"/>
+          <w:sz w:val="19"/>
+          <w:szCs w:val="19"/>
+        </w:rPr>
+        <w:t xml:space="preserve">→ Thêm client API subscription dùng chung, thông báo lỗi giới hạn gói song ngữ.</w:t>
+      </w:r>
+    </w:p>
+    <w:p>
+      <w:pPr>
+        <w:spacing w:after="20"/>
         <w:ind w:left="200"/>
       </w:pPr>
       <w:r>
@@ -1767,6 +2648,22 @@
     <w:p>
       <w:pPr>
         <w:spacing w:after="60"/>
+        <w:ind w:left="420"/>
+      </w:pPr>
+      <w:r>
+        <w:rPr>
+          <w:i/>
+          <w:iCs/>
+          <w:color w:val="444444"/>
+          <w:sz w:val="19"/>
+          <w:szCs w:val="19"/>
+        </w:rPr>
+        <w:t xml:space="preserve">→ Xây lại trang billing của HR theo đúng mô hình gói HR_FREE/HR_PREMIUM thật.</w:t>
+      </w:r>
+    </w:p>
+    <w:p>
+      <w:pPr>
+        <w:spacing w:after="20"/>
         <w:ind w:left="200"/>
       </w:pPr>
       <w:r>
@@ -1789,6 +2686,22 @@
     <w:p>
       <w:pPr>
         <w:spacing w:after="60"/>
+        <w:ind w:left="420"/>
+      </w:pPr>
+      <w:r>
+        <w:rPr>
+          <w:i/>
+          <w:iCs/>
+          <w:color w:val="444444"/>
+          <w:sz w:val="19"/>
+          <w:szCs w:val="19"/>
+        </w:rPr>
+        <w:t xml:space="preserve">→ Nối trang billing và tường phí luyện tập của candidate với API subscription thật.</w:t>
+      </w:r>
+    </w:p>
+    <w:p>
+      <w:pPr>
+        <w:spacing w:after="20"/>
         <w:ind w:left="200"/>
       </w:pPr>
       <w:r>
@@ -1811,6 +2724,22 @@
     <w:p>
       <w:pPr>
         <w:spacing w:after="60"/>
+        <w:ind w:left="420"/>
+      </w:pPr>
+      <w:r>
+        <w:rPr>
+          <w:i/>
+          <w:iCs/>
+          <w:color w:val="444444"/>
+          <w:sz w:val="19"/>
+          <w:szCs w:val="19"/>
+        </w:rPr>
+        <w:t xml:space="preserve">→ Hiện giá gói và danh sách tính năng thật lấy trực tiếp từ backend trên trang giá công khai.</w:t>
+      </w:r>
+    </w:p>
+    <w:p>
+      <w:pPr>
+        <w:spacing w:after="20"/>
         <w:ind w:left="200"/>
       </w:pPr>
       <w:r>
@@ -1833,6 +2762,22 @@
     <w:p>
       <w:pPr>
         <w:spacing w:after="60"/>
+        <w:ind w:left="420"/>
+      </w:pPr>
+      <w:r>
+        <w:rPr>
+          <w:i/>
+          <w:iCs/>
+          <w:color w:val="444444"/>
+          <w:sz w:val="19"/>
+          <w:szCs w:val="19"/>
+        </w:rPr>
+        <w:t xml:space="preserve">→ Thêm xác nhận thanh toán realtime qua SignalR, đồng thời dựng Question Builder, làm lại trang lịch sử/ứng viên của HR, marketplace admin, và cập nhật Studio.</w:t>
+      </w:r>
+    </w:p>
+    <w:p>
+      <w:pPr>
+        <w:spacing w:after="20"/>
         <w:ind w:left="200"/>
       </w:pPr>
       <w:r>
@@ -1855,6 +2800,22 @@
     <w:p>
       <w:pPr>
         <w:spacing w:after="60"/>
+        <w:ind w:left="420"/>
+      </w:pPr>
+      <w:r>
+        <w:rPr>
+          <w:i/>
+          <w:iCs/>
+          <w:color w:val="444444"/>
+          <w:sz w:val="19"/>
+          <w:szCs w:val="19"/>
+        </w:rPr>
+        <w:t xml:space="preserve">→ Củng cố độ ổn định của luồng subscription realtime, thanh toán, và cài đặt Studio.</w:t>
+      </w:r>
+    </w:p>
+    <w:p>
+      <w:pPr>
+        <w:spacing w:after="20"/>
         <w:ind w:left="200"/>
       </w:pPr>
       <w:r>
@@ -1877,6 +2838,22 @@
     <w:p>
       <w:pPr>
         <w:spacing w:after="60"/>
+        <w:ind w:left="420"/>
+      </w:pPr>
+      <w:r>
+        <w:rPr>
+          <w:i/>
+          <w:iCs/>
+          <w:color w:val="444444"/>
+          <w:sz w:val="19"/>
+          <w:szCs w:val="19"/>
+        </w:rPr>
+        <w:t xml:space="preserve">→ Thêm xác nhận trước khi hạ gói từ Premium xuống Free, tránh hạ gói ngoài ý muốn.</w:t>
+      </w:r>
+    </w:p>
+    <w:p>
+      <w:pPr>
+        <w:spacing w:after="20"/>
         <w:ind w:left="200"/>
       </w:pPr>
       <w:r>
@@ -1894,6 +2871,22 @@
           <w:szCs w:val="20"/>
         </w:rPr>
         <w:t xml:space="preserve">fix: unlock practice questions in place after upgrading</w:t>
+      </w:r>
+    </w:p>
+    <w:p>
+      <w:pPr>
+        <w:spacing w:after="60"/>
+        <w:ind w:left="420"/>
+      </w:pPr>
+      <w:r>
+        <w:rPr>
+          <w:i/>
+          <w:iCs/>
+          <w:color w:val="444444"/>
+          <w:sz w:val="19"/>
+          <w:szCs w:val="19"/>
+        </w:rPr>
+        <w:t xml:space="preserve">→ Sửa lỗi câu hỏi luyện tập không tự mở khóa ngay tại chỗ sau khi nâng cấp gói.</w:t>
       </w:r>
     </w:p>
     <w:p>
@@ -1907,7 +2900,7 @@
     </w:p>
     <w:p>
       <w:pPr>
-        <w:spacing w:after="60"/>
+        <w:spacing w:after="20"/>
         <w:ind w:left="200"/>
       </w:pPr>
       <w:r>
@@ -1930,6 +2923,22 @@
     <w:p>
       <w:pPr>
         <w:spacing w:after="60"/>
+        <w:ind w:left="420"/>
+      </w:pPr>
+      <w:r>
+        <w:rPr>
+          <w:i/>
+          <w:iCs/>
+          <w:color w:val="444444"/>
+          <w:sz w:val="19"/>
+          <w:szCs w:val="19"/>
+        </w:rPr>
+        <w:t xml:space="preserve">→ Thêm trang Quản lý gói dịch vụ và Cấu hình AI cho Admin.</w:t>
+      </w:r>
+    </w:p>
+    <w:p>
+      <w:pPr>
+        <w:spacing w:after="20"/>
         <w:ind w:left="200"/>
       </w:pPr>
       <w:r>
@@ -1952,6 +2961,22 @@
     <w:p>
       <w:pPr>
         <w:spacing w:after="60"/>
+        <w:ind w:left="420"/>
+      </w:pPr>
+      <w:r>
+        <w:rPr>
+          <w:i/>
+          <w:iCs/>
+          <w:color w:val="444444"/>
+          <w:sz w:val="19"/>
+          <w:szCs w:val="19"/>
+        </w:rPr>
+        <w:t xml:space="preserve">→ Hiện huy hiệu gói dịch vụ và cho phép quản lý Premium ngay trong trang Quản lý người dùng.</w:t>
+      </w:r>
+    </w:p>
+    <w:p>
+      <w:pPr>
+        <w:spacing w:after="20"/>
         <w:ind w:left="200"/>
       </w:pPr>
       <w:r>
@@ -1974,6 +2999,22 @@
     <w:p>
       <w:pPr>
         <w:spacing w:after="60"/>
+        <w:ind w:left="420"/>
+      </w:pPr>
+      <w:r>
+        <w:rPr>
+          <w:i/>
+          <w:iCs/>
+          <w:color w:val="444444"/>
+          <w:sz w:val="19"/>
+          <w:szCs w:val="19"/>
+        </w:rPr>
+        <w:t xml:space="preserve">→ Hỗ trợ tạo hàng loạt công ty cùng lúc.</w:t>
+      </w:r>
+    </w:p>
+    <w:p>
+      <w:pPr>
+        <w:spacing w:after="20"/>
         <w:ind w:left="200"/>
       </w:pPr>
       <w:r>
@@ -1991,6 +3032,22 @@
           <w:szCs w:val="20"/>
         </w:rPr>
         <w:t xml:space="preserve">fix: clamp plan price and limit inputs to non-negative values</w:t>
+      </w:r>
+    </w:p>
+    <w:p>
+      <w:pPr>
+        <w:spacing w:after="60"/>
+        <w:ind w:left="420"/>
+      </w:pPr>
+      <w:r>
+        <w:rPr>
+          <w:i/>
+          <w:iCs/>
+          <w:color w:val="444444"/>
+          <w:sz w:val="19"/>
+          <w:szCs w:val="19"/>
+        </w:rPr>
+        <w:t xml:space="preserve">→ Chặn nhập giá/giới hạn gói dịch vụ thành số âm.</w:t>
       </w:r>
     </w:p>
     <w:p>
@@ -2013,7 +3070,7 @@
     </w:p>
     <w:p>
       <w:pPr>
-        <w:spacing w:after="60"/>
+        <w:spacing w:after="20"/>
         <w:ind w:left="200"/>
       </w:pPr>
       <w:r>
@@ -2036,6 +3093,22 @@
     <w:p>
       <w:pPr>
         <w:spacing w:after="60"/>
+        <w:ind w:left="420"/>
+      </w:pPr>
+      <w:r>
+        <w:rPr>
+          <w:i/>
+          <w:iCs/>
+          <w:color w:val="444444"/>
+          <w:sz w:val="19"/>
+          <w:szCs w:val="19"/>
+        </w:rPr>
+        <w:t xml:space="preserve">→ Dịch toàn bộ chuỗi chữ cứng ở trang sinh câu hỏi và lịch sử sang dùng context ngôn ngữ, thay vì gắn cứng tiếng Anh.</w:t>
+      </w:r>
+    </w:p>
+    <w:p>
+      <w:pPr>
+        <w:spacing w:after="20"/>
         <w:ind w:left="200"/>
       </w:pPr>
       <w:r>
@@ -2058,6 +3131,22 @@
     <w:p>
       <w:pPr>
         <w:spacing w:after="60"/>
+        <w:ind w:left="420"/>
+      </w:pPr>
+      <w:r>
+        <w:rPr>
+          <w:i/>
+          <w:iCs/>
+          <w:color w:val="444444"/>
+          <w:sz w:val="19"/>
+          <w:szCs w:val="19"/>
+        </w:rPr>
+        <w:t xml:space="preserve">→ Thêm chuỗi dịch cho lời mời, đồng bộ CV, tạo công ty hàng loạt, tải JD.</w:t>
+      </w:r>
+    </w:p>
+    <w:p>
+      <w:pPr>
+        <w:spacing w:after="20"/>
         <w:ind w:left="200"/>
       </w:pPr>
       <w:r>
@@ -2075,6 +3164,22 @@
           <w:szCs w:val="20"/>
         </w:rPr>
         <w:t xml:space="preserve">feat: add subscription/offer/admin strings, fall back vi to en for new keys</w:t>
+      </w:r>
+    </w:p>
+    <w:p>
+      <w:pPr>
+        <w:spacing w:after="60"/>
+        <w:ind w:left="420"/>
+      </w:pPr>
+      <w:r>
+        <w:rPr>
+          <w:i/>
+          <w:iCs/>
+          <w:color w:val="444444"/>
+          <w:sz w:val="19"/>
+          <w:szCs w:val="19"/>
+        </w:rPr>
+        <w:t xml:space="preserve">→ Thêm chuỗi dịch cho subscription/offer/admin, tự động dùng tiếng Anh cho khóa dịch còn thiếu ở tiếng Việt.</w:t>
       </w:r>
     </w:p>
     <w:p>
@@ -2088,7 +3193,7 @@
     </w:p>
     <w:p>
       <w:pPr>
-        <w:spacing w:after="60"/>
+        <w:spacing w:after="20"/>
         <w:ind w:left="200"/>
       </w:pPr>
       <w:r>
@@ -2111,6 +3216,22 @@
     <w:p>
       <w:pPr>
         <w:spacing w:after="60"/>
+        <w:ind w:left="420"/>
+      </w:pPr>
+      <w:r>
+        <w:rPr>
+          <w:i/>
+          <w:iCs/>
+          <w:color w:val="444444"/>
+          <w:sz w:val="19"/>
+          <w:szCs w:val="19"/>
+        </w:rPr>
+        <w:t xml:space="preserve">→ Tải ảnh logo công ty/avatar theo kiểu lazy-load ở các trang danh sách/lưới, giảm thời gian tải ban đầu.</w:t>
+      </w:r>
+    </w:p>
+    <w:p>
+      <w:pPr>
+        <w:spacing w:after="20"/>
         <w:ind w:left="200"/>
       </w:pPr>
       <w:r>
@@ -2133,6 +3254,22 @@
     <w:p>
       <w:pPr>
         <w:spacing w:after="60"/>
+        <w:ind w:left="420"/>
+      </w:pPr>
+      <w:r>
+        <w:rPr>
+          <w:i/>
+          <w:iCs/>
+          <w:color w:val="444444"/>
+          <w:sz w:val="19"/>
+          <w:szCs w:val="19"/>
+        </w:rPr>
+        <w:t xml:space="preserve">→ Ghi nhớ (memoize) giá trị các Context Provider và tải từ điển tiếng Việt kiểu lazy, tránh render lại không cần thiết.</w:t>
+      </w:r>
+    </w:p>
+    <w:p>
+      <w:pPr>
+        <w:spacing w:after="20"/>
         <w:ind w:left="200"/>
       </w:pPr>
       <w:r>
@@ -2155,6 +3292,22 @@
     <w:p>
       <w:pPr>
         <w:spacing w:after="60"/>
+        <w:ind w:left="420"/>
+      </w:pPr>
+      <w:r>
+        <w:rPr>
+          <w:i/>
+          <w:iCs/>
+          <w:color w:val="444444"/>
+          <w:sz w:val="19"/>
+          <w:szCs w:val="19"/>
+        </w:rPr>
+        <w:t xml:space="preserve">→ Giảm kích thước bundle JS của trang sinh câu hỏi/review.</w:t>
+      </w:r>
+    </w:p>
+    <w:p>
+      <w:pPr>
+        <w:spacing w:after="20"/>
         <w:ind w:left="200"/>
       </w:pPr>
       <w:r>
@@ -2172,6 +3325,22 @@
           <w:szCs w:val="20"/>
         </w:rPr>
         <w:t xml:space="preserve">perf: cache and de-dupe concurrent job-list fetches</w:t>
+      </w:r>
+    </w:p>
+    <w:p>
+      <w:pPr>
+        <w:spacing w:after="60"/>
+        <w:ind w:left="420"/>
+      </w:pPr>
+      <w:r>
+        <w:rPr>
+          <w:i/>
+          <w:iCs/>
+          <w:color w:val="444444"/>
+          <w:sz w:val="19"/>
+          <w:szCs w:val="19"/>
+        </w:rPr>
+        <w:t xml:space="preserve">→ Cache và loại bỏ trùng lặp các lượt gọi API lấy danh sách job đang chạy đồng thời.</w:t>
       </w:r>
     </w:p>
     <w:p>
@@ -3227,6 +4396,282 @@
           </w:p>
         </w:tc>
       </w:tr>
+      <w:tr>
+        <w:tc>
+          <w:tcPr>
+            <w:tcW w:type="pct" w:w="45%"/>
+            <w:tcBorders>
+              <w:top w:val="single" w:color="CCCCCC" w:sz="4"/>
+              <w:left w:val="single" w:color="CCCCCC" w:sz="4"/>
+              <w:bottom w:val="single" w:color="CCCCCC" w:sz="4"/>
+              <w:right w:val="single" w:color="CCCCCC" w:sz="4"/>
+            </w:tcBorders>
+            <w:tcMar>
+              <w:top w:type="dxa" w:w="80"/>
+              <w:left w:type="dxa" w:w="100"/>
+              <w:bottom w:type="dxa" w:w="80"/>
+              <w:right w:type="dxa" w:w="100"/>
+            </w:tcMar>
+            <w:vAlign w:val="top"/>
+          </w:tcPr>
+          <w:p>
+            <w:pPr>
+              <w:spacing w:after="0"/>
+            </w:pPr>
+            <w:r>
+              <w:rPr>
+                <w:sz w:val="20"/>
+                <w:szCs w:val="20"/>
+              </w:rPr>
+              <w:t xml:space="preserve">Trạng thái khoá tính năng Premium bị mất khi resume lại một phiên luyện tập đang dở</w:t>
+            </w:r>
+          </w:p>
+        </w:tc>
+        <w:tc>
+          <w:tcPr>
+            <w:tcW w:type="pct" w:w="20%"/>
+            <w:tcBorders>
+              <w:top w:val="single" w:color="CCCCCC" w:sz="4"/>
+              <w:left w:val="single" w:color="CCCCCC" w:sz="4"/>
+              <w:bottom w:val="single" w:color="CCCCCC" w:sz="4"/>
+              <w:right w:val="single" w:color="CCCCCC" w:sz="4"/>
+            </w:tcBorders>
+            <w:tcMar>
+              <w:top w:type="dxa" w:w="80"/>
+              <w:left w:type="dxa" w:w="100"/>
+              <w:bottom w:type="dxa" w:w="80"/>
+              <w:right w:type="dxa" w:w="100"/>
+            </w:tcMar>
+            <w:vAlign w:val="top"/>
+          </w:tcPr>
+          <w:p>
+            <w:pPr>
+              <w:spacing w:after="0"/>
+            </w:pPr>
+            <w:r>
+              <w:rPr>
+                <w:sz w:val="20"/>
+                <w:szCs w:val="20"/>
+              </w:rPr>
+              <w:t xml:space="preserve">8ecdf3b</w:t>
+            </w:r>
+          </w:p>
+        </w:tc>
+        <w:tc>
+          <w:tcPr>
+            <w:tcW w:type="pct" w:w="35%"/>
+            <w:tcBorders>
+              <w:top w:val="single" w:color="CCCCCC" w:sz="4"/>
+              <w:left w:val="single" w:color="CCCCCC" w:sz="4"/>
+              <w:bottom w:val="single" w:color="CCCCCC" w:sz="4"/>
+              <w:right w:val="single" w:color="CCCCCC" w:sz="4"/>
+            </w:tcBorders>
+            <w:tcMar>
+              <w:top w:type="dxa" w:w="80"/>
+              <w:left w:type="dxa" w:w="100"/>
+              <w:bottom w:type="dxa" w:w="80"/>
+              <w:right w:type="dxa" w:w="100"/>
+            </w:tcMar>
+            <w:vAlign w:val="top"/>
+          </w:tcPr>
+          <w:p>
+            <w:pPr>
+              <w:spacing w:after="0"/>
+            </w:pPr>
+            <w:r>
+              <w:rPr>
+                <w:sz w:val="20"/>
+                <w:szCs w:val="20"/>
+              </w:rPr>
+              <w:t xml:space="preserve">Phát hiện khi test lại luồng thoát-rồi-quay-lại phiên luyện tập — candidate có thể vô tình truy cập lại nội dung lẽ ra phải khoá theo gói dịch vụ.</w:t>
+            </w:r>
+          </w:p>
+        </w:tc>
+      </w:tr>
+      <w:tr>
+        <w:tc>
+          <w:tcPr>
+            <w:tcW w:type="pct" w:w="45%"/>
+            <w:tcBorders>
+              <w:top w:val="single" w:color="CCCCCC" w:sz="4"/>
+              <w:left w:val="single" w:color="CCCCCC" w:sz="4"/>
+              <w:bottom w:val="single" w:color="CCCCCC" w:sz="4"/>
+              <w:right w:val="single" w:color="CCCCCC" w:sz="4"/>
+            </w:tcBorders>
+            <w:tcMar>
+              <w:top w:type="dxa" w:w="80"/>
+              <w:left w:type="dxa" w:w="100"/>
+              <w:bottom w:type="dxa" w:w="80"/>
+              <w:right w:type="dxa" w:w="100"/>
+            </w:tcMar>
+            <w:vAlign w:val="top"/>
+          </w:tcPr>
+          <w:p>
+            <w:pPr>
+              <w:spacing w:after="0"/>
+            </w:pPr>
+            <w:r>
+              <w:rPr>
+                <w:sz w:val="20"/>
+                <w:szCs w:val="20"/>
+              </w:rPr>
+              <w:t xml:space="preserve">Nút hủy gói dịch vụ bị bấm trùng (double-click) gây gọi API hủy hai lần</w:t>
+            </w:r>
+          </w:p>
+        </w:tc>
+        <w:tc>
+          <w:tcPr>
+            <w:tcW w:type="pct" w:w="20%"/>
+            <w:tcBorders>
+              <w:top w:val="single" w:color="CCCCCC" w:sz="4"/>
+              <w:left w:val="single" w:color="CCCCCC" w:sz="4"/>
+              <w:bottom w:val="single" w:color="CCCCCC" w:sz="4"/>
+              <w:right w:val="single" w:color="CCCCCC" w:sz="4"/>
+            </w:tcBorders>
+            <w:tcMar>
+              <w:top w:type="dxa" w:w="80"/>
+              <w:left w:type="dxa" w:w="100"/>
+              <w:bottom w:type="dxa" w:w="80"/>
+              <w:right w:type="dxa" w:w="100"/>
+            </w:tcMar>
+            <w:vAlign w:val="top"/>
+          </w:tcPr>
+          <w:p>
+            <w:pPr>
+              <w:spacing w:after="0"/>
+            </w:pPr>
+            <w:r>
+              <w:rPr>
+                <w:sz w:val="20"/>
+                <w:szCs w:val="20"/>
+              </w:rPr>
+              <w:t xml:space="preserve">8ecdf3b</w:t>
+            </w:r>
+          </w:p>
+        </w:tc>
+        <w:tc>
+          <w:tcPr>
+            <w:tcW w:type="pct" w:w="35%"/>
+            <w:tcBorders>
+              <w:top w:val="single" w:color="CCCCCC" w:sz="4"/>
+              <w:left w:val="single" w:color="CCCCCC" w:sz="4"/>
+              <w:bottom w:val="single" w:color="CCCCCC" w:sz="4"/>
+              <w:right w:val="single" w:color="CCCCCC" w:sz="4"/>
+            </w:tcBorders>
+            <w:tcMar>
+              <w:top w:type="dxa" w:w="80"/>
+              <w:left w:type="dxa" w:w="100"/>
+              <w:bottom w:type="dxa" w:w="80"/>
+              <w:right w:type="dxa" w:w="100"/>
+            </w:tcMar>
+            <w:vAlign w:val="top"/>
+          </w:tcPr>
+          <w:p>
+            <w:pPr>
+              <w:spacing w:after="0"/>
+            </w:pPr>
+            <w:r>
+              <w:rPr>
+                <w:sz w:val="20"/>
+                <w:szCs w:val="20"/>
+              </w:rPr>
+              <w:t xml:space="preserve">Phát hiện khi thao tác nhanh liên tiếp — lỗi race-condition điển hình khi không khoá nút trong lúc request đang chạy.</w:t>
+            </w:r>
+          </w:p>
+        </w:tc>
+      </w:tr>
+      <w:tr>
+        <w:tc>
+          <w:tcPr>
+            <w:tcW w:type="pct" w:w="45%"/>
+            <w:tcBorders>
+              <w:top w:val="single" w:color="CCCCCC" w:sz="4"/>
+              <w:left w:val="single" w:color="CCCCCC" w:sz="4"/>
+              <w:bottom w:val="single" w:color="CCCCCC" w:sz="4"/>
+              <w:right w:val="single" w:color="CCCCCC" w:sz="4"/>
+            </w:tcBorders>
+            <w:tcMar>
+              <w:top w:type="dxa" w:w="80"/>
+              <w:left w:type="dxa" w:w="100"/>
+              <w:bottom w:type="dxa" w:w="80"/>
+              <w:right w:type="dxa" w:w="100"/>
+            </w:tcMar>
+            <w:vAlign w:val="top"/>
+          </w:tcPr>
+          <w:p>
+            <w:pPr>
+              <w:spacing w:after="0"/>
+            </w:pPr>
+            <w:r>
+              <w:rPr>
+                <w:sz w:val="20"/>
+                <w:szCs w:val="20"/>
+              </w:rPr>
+              <w:t xml:space="preserve">Upload avatar làm rò rỉ các thay đổi hồ sơ khác chưa lưu ra ngoài ý muốn</w:t>
+            </w:r>
+          </w:p>
+        </w:tc>
+        <w:tc>
+          <w:tcPr>
+            <w:tcW w:type="pct" w:w="20%"/>
+            <w:tcBorders>
+              <w:top w:val="single" w:color="CCCCCC" w:sz="4"/>
+              <w:left w:val="single" w:color="CCCCCC" w:sz="4"/>
+              <w:bottom w:val="single" w:color="CCCCCC" w:sz="4"/>
+              <w:right w:val="single" w:color="CCCCCC" w:sz="4"/>
+            </w:tcBorders>
+            <w:tcMar>
+              <w:top w:type="dxa" w:w="80"/>
+              <w:left w:type="dxa" w:w="100"/>
+              <w:bottom w:type="dxa" w:w="80"/>
+              <w:right w:type="dxa" w:w="100"/>
+            </w:tcMar>
+            <w:vAlign w:val="top"/>
+          </w:tcPr>
+          <w:p>
+            <w:pPr>
+              <w:spacing w:after="0"/>
+            </w:pPr>
+            <w:r>
+              <w:rPr>
+                <w:sz w:val="20"/>
+                <w:szCs w:val="20"/>
+              </w:rPr>
+              <w:t xml:space="preserve">8ecdf3b</w:t>
+            </w:r>
+          </w:p>
+        </w:tc>
+        <w:tc>
+          <w:tcPr>
+            <w:tcW w:type="pct" w:w="35%"/>
+            <w:tcBorders>
+              <w:top w:val="single" w:color="CCCCCC" w:sz="4"/>
+              <w:left w:val="single" w:color="CCCCCC" w:sz="4"/>
+              <w:bottom w:val="single" w:color="CCCCCC" w:sz="4"/>
+              <w:right w:val="single" w:color="CCCCCC" w:sz="4"/>
+            </w:tcBorders>
+            <w:tcMar>
+              <w:top w:type="dxa" w:w="80"/>
+              <w:left w:type="dxa" w:w="100"/>
+              <w:bottom w:type="dxa" w:w="80"/>
+              <w:right w:type="dxa" w:w="100"/>
+            </w:tcMar>
+            <w:vAlign w:val="top"/>
+          </w:tcPr>
+          <w:p>
+            <w:pPr>
+              <w:spacing w:after="0"/>
+            </w:pPr>
+            <w:r>
+              <w:rPr>
+                <w:sz w:val="20"/>
+                <w:szCs w:val="20"/>
+              </w:rPr>
+              <w:t xml:space="preserve">Phát hiện khi test luồng chỉnh nhiều trường hồ sơ cùng lúc rồi đổi avatar — một thao tác phụ (đổi avatar) vô tình làm lộ/lưu nhầm dữ liệu của thao tác chính chưa được xác nhận lưu.</w:t>
+            </w:r>
+          </w:p>
+        </w:tc>
+      </w:tr>
     </w:tbl>
     <w:p>
       <w:pPr>

</xml_diff>